<commit_message>
Added footnote font size
</commit_message>
<xml_diff>
--- a/reference_template.docx
+++ b/reference_template.docx
@@ -9,8 +9,12 @@
       </w:pPr>
     </w:p>
     <w:sectPr>
-      <w:footerReference w:type="even" r:id="rId8"/>
-      <w:footerReference w:type="default" r:id="rId9"/>
+      <w:headerReference w:type="even" r:id="rId8"/>
+      <w:headerReference w:type="default" r:id="rId9"/>
+      <w:footerReference w:type="even" r:id="rId10"/>
+      <w:footerReference w:type="default" r:id="rId11"/>
+      <w:headerReference w:type="first" r:id="rId12"/>
+      <w:footerReference w:type="first" r:id="rId13"/>
       <w:pgSz w:w="12240" w:h="15840"/>
       <w:pgMar w:top="1417" w:right="1417" w:bottom="1417" w:left="1417" w:header="720" w:footer="720" w:gutter="0"/>
       <w:lnNumType w:countBy="1" w:restart="continuous"/>
@@ -107,59 +111,25 @@
 <w:ftr xmlns:wpc="http://schemas.microsoft.com/office/word/2010/wordprocessingCanvas" xmlns:cx="http://schemas.microsoft.com/office/drawing/2014/chartex" xmlns:cx1="http://schemas.microsoft.com/office/drawing/2015/9/8/chartex" xmlns:cx2="http://schemas.microsoft.com/office/drawing/2015/10/21/chartex" xmlns:cx3="http://schemas.microsoft.com/office/drawing/2016/5/9/chartex" xmlns:cx4="http://schemas.microsoft.com/office/drawing/2016/5/10/chartex" xmlns:cx5="http://schemas.microsoft.com/office/drawing/2016/5/11/chartex" xmlns:cx6="http://schemas.microsoft.com/office/drawing/2016/5/12/chartex" xmlns:cx7="http://schemas.microsoft.com/office/drawing/2016/5/13/chartex" xmlns:cx8="http://schemas.microsoft.com/office/drawing/2016/5/14/chartex" xmlns:mc="http://schemas.openxmlformats.org/markup-compatibility/2006" xmlns:aink="http://schemas.microsoft.com/office/drawing/2016/ink" xmlns:am3d="http://schemas.microsoft.com/office/drawing/2017/model3d" xmlns:o="urn:schemas-microsoft-com:office:office" xmlns:r="http://schemas.openxmlformats.org/officeDocument/2006/relationships" xmlns:m="http://schemas.openxmlformats.org/officeDocument/2006/math" xmlns:v="urn:schemas-microsoft-com:vml" xmlns:wp14="http://schemas.microsoft.com/office/word/2010/wordprocessingDrawing" xmlns:wp="http://schemas.openxmlformats.org/drawingml/2006/wordprocessingDrawing" xmlns:w10="urn:schemas-microsoft-com:office:word" xmlns:w="http://schemas.openxmlformats.org/wordprocessingml/2006/main" xmlns:w14="http://schemas.microsoft.com/office/word/2010/wordml" xmlns:w15="http://schemas.microsoft.com/office/word/2012/wordml" xmlns:w16cex="http://schemas.microsoft.com/office/word/2018/wordml/cex" xmlns:w16cid="http://schemas.microsoft.com/office/word/2016/wordml/cid" xmlns:w16="http://schemas.microsoft.com/office/word/2018/wordml" xmlns:w16sdtdh="http://schemas.microsoft.com/office/word/2020/wordml/sdtdatahash" xmlns:w16se="http://schemas.microsoft.com/office/word/2015/wordml/symex" xmlns:wpg="http://schemas.microsoft.com/office/word/2010/wordprocessingGroup" xmlns:wpi="http://schemas.microsoft.com/office/word/2010/wordprocessingInk" xmlns:wne="http://schemas.microsoft.com/office/word/2006/wordml" xmlns:wps="http://schemas.microsoft.com/office/word/2010/wordprocessingShape" mc:Ignorable="w14 w15 w16se w16cid w16 w16cex w16sdtdh wp14">
   <w:sdt>
     <w:sdtPr>
-      <w:rPr>
-        <w:rStyle w:val="PageNumber"/>
-      </w:rPr>
-      <w:id w:val="928616856"/>
-      <w:docPartObj>
-        <w:docPartGallery w:val="Page Numbers (Bottom of Page)"/>
-        <w:docPartUnique/>
-      </w:docPartObj>
+      <w:id w:val="969169713"/>
+      <w:placeholder>
+        <w:docPart w:val="BC1A84D5C2E740B1A4E9102D7AFA3504"/>
+      </w:placeholder>
+      <w:temporary/>
+      <w:showingPlcHdr/>
+      <w15:appearance w15:val="hidden"/>
     </w:sdtPr>
-    <w:sdtEndPr>
-      <w:rPr>
-        <w:rStyle w:val="PageNumber"/>
-      </w:rPr>
-    </w:sdtEndPr>
     <w:sdtContent>
       <w:p>
         <w:pPr>
           <w:pStyle w:val="Footer"/>
-          <w:framePr w:wrap="none" w:vAnchor="text" w:hAnchor="margin" w:xAlign="center" w:y="1"/>
-          <w:rPr>
-            <w:rStyle w:val="PageNumber"/>
-          </w:rPr>
         </w:pPr>
         <w:r>
           <w:rPr>
-            <w:rStyle w:val="PageNumber"/>
+            <w:sz w:val="18"/>
+            <w:szCs w:val="18"/>
           </w:rPr>
-          <w:fldChar w:fldCharType="begin"/>
-        </w:r>
-        <w:r>
-          <w:rPr>
-            <w:rStyle w:val="PageNumber"/>
-          </w:rPr>
-          <w:instrText xml:space="preserve"> PAGE </w:instrText>
-        </w:r>
-        <w:r>
-          <w:rPr>
-            <w:rStyle w:val="PageNumber"/>
-          </w:rPr>
-          <w:fldChar w:fldCharType="separate"/>
-        </w:r>
-        <w:r>
-          <w:rPr>
-            <w:rStyle w:val="PageNumber"/>
-            <w:noProof/>
-          </w:rPr>
-          <w:t>2</w:t>
-        </w:r>
-        <w:r>
-          <w:rPr>
-            <w:rStyle w:val="PageNumber"/>
-          </w:rPr>
-          <w:fldChar w:fldCharType="end"/>
+          <w:t>[Type here]</w:t>
         </w:r>
       </w:p>
     </w:sdtContent>
@@ -173,6 +143,16 @@
 </w:ftr>
 </file>
 
+<file path=word/footer3.xml><?xml version="1.0" encoding="utf-8"?>
+<w:ftr xmlns:wpc="http://schemas.microsoft.com/office/word/2010/wordprocessingCanvas" xmlns:cx="http://schemas.microsoft.com/office/drawing/2014/chartex" xmlns:cx1="http://schemas.microsoft.com/office/drawing/2015/9/8/chartex" xmlns:cx2="http://schemas.microsoft.com/office/drawing/2015/10/21/chartex" xmlns:cx3="http://schemas.microsoft.com/office/drawing/2016/5/9/chartex" xmlns:cx4="http://schemas.microsoft.com/office/drawing/2016/5/10/chartex" xmlns:cx5="http://schemas.microsoft.com/office/drawing/2016/5/11/chartex" xmlns:cx6="http://schemas.microsoft.com/office/drawing/2016/5/12/chartex" xmlns:cx7="http://schemas.microsoft.com/office/drawing/2016/5/13/chartex" xmlns:cx8="http://schemas.microsoft.com/office/drawing/2016/5/14/chartex" xmlns:mc="http://schemas.openxmlformats.org/markup-compatibility/2006" xmlns:aink="http://schemas.microsoft.com/office/drawing/2016/ink" xmlns:am3d="http://schemas.microsoft.com/office/drawing/2017/model3d" xmlns:o="urn:schemas-microsoft-com:office:office" xmlns:r="http://schemas.openxmlformats.org/officeDocument/2006/relationships" xmlns:m="http://schemas.openxmlformats.org/officeDocument/2006/math" xmlns:v="urn:schemas-microsoft-com:vml" xmlns:wp14="http://schemas.microsoft.com/office/word/2010/wordprocessingDrawing" xmlns:wp="http://schemas.openxmlformats.org/drawingml/2006/wordprocessingDrawing" xmlns:w10="urn:schemas-microsoft-com:office:word" xmlns:w="http://schemas.openxmlformats.org/wordprocessingml/2006/main" xmlns:w14="http://schemas.microsoft.com/office/word/2010/wordml" xmlns:w15="http://schemas.microsoft.com/office/word/2012/wordml" xmlns:w16cex="http://schemas.microsoft.com/office/word/2018/wordml/cex" xmlns:w16cid="http://schemas.microsoft.com/office/word/2016/wordml/cid" xmlns:w16="http://schemas.microsoft.com/office/word/2018/wordml" xmlns:w16sdtdh="http://schemas.microsoft.com/office/word/2020/wordml/sdtdatahash" xmlns:w16se="http://schemas.microsoft.com/office/word/2015/wordml/symex" xmlns:wpg="http://schemas.microsoft.com/office/word/2010/wordprocessingGroup" xmlns:wpi="http://schemas.microsoft.com/office/word/2010/wordprocessingInk" xmlns:wne="http://schemas.microsoft.com/office/word/2006/wordml" xmlns:wps="http://schemas.microsoft.com/office/word/2010/wordprocessingShape" mc:Ignorable="w14 w15 w16se w16cid w16 w16cex w16sdtdh wp14">
+  <w:p>
+    <w:pPr>
+      <w:pStyle w:val="Footer"/>
+    </w:pPr>
+  </w:p>
+</w:ftr>
+</file>
+
 <file path=word/footnotes.xml><?xml version="1.0" encoding="utf-8"?>
 <w:footnotes xmlns:wpc="http://schemas.microsoft.com/office/word/2010/wordprocessingCanvas" xmlns:cx="http://schemas.microsoft.com/office/drawing/2014/chartex" xmlns:cx1="http://schemas.microsoft.com/office/drawing/2015/9/8/chartex" xmlns:cx2="http://schemas.microsoft.com/office/drawing/2015/10/21/chartex" xmlns:cx3="http://schemas.microsoft.com/office/drawing/2016/5/9/chartex" xmlns:cx4="http://schemas.microsoft.com/office/drawing/2016/5/10/chartex" xmlns:cx5="http://schemas.microsoft.com/office/drawing/2016/5/11/chartex" xmlns:cx6="http://schemas.microsoft.com/office/drawing/2016/5/12/chartex" xmlns:cx7="http://schemas.microsoft.com/office/drawing/2016/5/13/chartex" xmlns:cx8="http://schemas.microsoft.com/office/drawing/2016/5/14/chartex" xmlns:mc="http://schemas.openxmlformats.org/markup-compatibility/2006" xmlns:aink="http://schemas.microsoft.com/office/drawing/2016/ink" xmlns:am3d="http://schemas.microsoft.com/office/drawing/2017/model3d" xmlns:o="urn:schemas-microsoft-com:office:office" xmlns:r="http://schemas.openxmlformats.org/officeDocument/2006/relationships" xmlns:m="http://schemas.openxmlformats.org/officeDocument/2006/math" xmlns:v="urn:schemas-microsoft-com:vml" xmlns:wp14="http://schemas.microsoft.com/office/word/2010/wordprocessingDrawing" xmlns:wp="http://schemas.openxmlformats.org/drawingml/2006/wordprocessingDrawing" xmlns:w10="urn:schemas-microsoft-com:office:word" xmlns:w="http://schemas.openxmlformats.org/wordprocessingml/2006/main" xmlns:w14="http://schemas.microsoft.com/office/word/2010/wordml" xmlns:w15="http://schemas.microsoft.com/office/word/2012/wordml" xmlns:w16cex="http://schemas.microsoft.com/office/word/2018/wordml/cex" xmlns:w16cid="http://schemas.microsoft.com/office/word/2016/wordml/cid" xmlns:w16="http://schemas.microsoft.com/office/word/2018/wordml" xmlns:w16sdtdh="http://schemas.microsoft.com/office/word/2020/wordml/sdtdatahash" xmlns:w16se="http://schemas.microsoft.com/office/word/2015/wordml/symex" xmlns:wpg="http://schemas.microsoft.com/office/word/2010/wordprocessingGroup" xmlns:wpi="http://schemas.microsoft.com/office/word/2010/wordprocessingInk" xmlns:wne="http://schemas.microsoft.com/office/word/2006/wordml" xmlns:wps="http://schemas.microsoft.com/office/word/2010/wordprocessingShape" mc:Ignorable="w14 w15 w16se w16cid w16 w16cex w16sdtdh wp14">
   <w:footnote w:type="separator" w:id="-1">
@@ -196,6 +176,36 @@
     </w:p>
   </w:footnote>
 </w:footnotes>
+</file>
+
+<file path=word/header1.xml><?xml version="1.0" encoding="utf-8"?>
+<w:hdr xmlns:wpc="http://schemas.microsoft.com/office/word/2010/wordprocessingCanvas" xmlns:cx="http://schemas.microsoft.com/office/drawing/2014/chartex" xmlns:cx1="http://schemas.microsoft.com/office/drawing/2015/9/8/chartex" xmlns:cx2="http://schemas.microsoft.com/office/drawing/2015/10/21/chartex" xmlns:cx3="http://schemas.microsoft.com/office/drawing/2016/5/9/chartex" xmlns:cx4="http://schemas.microsoft.com/office/drawing/2016/5/10/chartex" xmlns:cx5="http://schemas.microsoft.com/office/drawing/2016/5/11/chartex" xmlns:cx6="http://schemas.microsoft.com/office/drawing/2016/5/12/chartex" xmlns:cx7="http://schemas.microsoft.com/office/drawing/2016/5/13/chartex" xmlns:cx8="http://schemas.microsoft.com/office/drawing/2016/5/14/chartex" xmlns:mc="http://schemas.openxmlformats.org/markup-compatibility/2006" xmlns:aink="http://schemas.microsoft.com/office/drawing/2016/ink" xmlns:am3d="http://schemas.microsoft.com/office/drawing/2017/model3d" xmlns:o="urn:schemas-microsoft-com:office:office" xmlns:r="http://schemas.openxmlformats.org/officeDocument/2006/relationships" xmlns:m="http://schemas.openxmlformats.org/officeDocument/2006/math" xmlns:v="urn:schemas-microsoft-com:vml" xmlns:wp14="http://schemas.microsoft.com/office/word/2010/wordprocessingDrawing" xmlns:wp="http://schemas.openxmlformats.org/drawingml/2006/wordprocessingDrawing" xmlns:w10="urn:schemas-microsoft-com:office:word" xmlns:w="http://schemas.openxmlformats.org/wordprocessingml/2006/main" xmlns:w14="http://schemas.microsoft.com/office/word/2010/wordml" xmlns:w15="http://schemas.microsoft.com/office/word/2012/wordml" xmlns:w16cex="http://schemas.microsoft.com/office/word/2018/wordml/cex" xmlns:w16cid="http://schemas.microsoft.com/office/word/2016/wordml/cid" xmlns:w16="http://schemas.microsoft.com/office/word/2018/wordml" xmlns:w16sdtdh="http://schemas.microsoft.com/office/word/2020/wordml/sdtdatahash" xmlns:w16se="http://schemas.microsoft.com/office/word/2015/wordml/symex" xmlns:wpg="http://schemas.microsoft.com/office/word/2010/wordprocessingGroup" xmlns:wpi="http://schemas.microsoft.com/office/word/2010/wordprocessingInk" xmlns:wne="http://schemas.microsoft.com/office/word/2006/wordml" xmlns:wps="http://schemas.microsoft.com/office/word/2010/wordprocessingShape" mc:Ignorable="w14 w15 w16se w16cid w16 w16cex w16sdtdh wp14">
+  <w:p>
+    <w:pPr>
+      <w:pStyle w:val="Header"/>
+    </w:pPr>
+  </w:p>
+</w:hdr>
+</file>
+
+<file path=word/header2.xml><?xml version="1.0" encoding="utf-8"?>
+<w:hdr xmlns:wpc="http://schemas.microsoft.com/office/word/2010/wordprocessingCanvas" xmlns:cx="http://schemas.microsoft.com/office/drawing/2014/chartex" xmlns:cx1="http://schemas.microsoft.com/office/drawing/2015/9/8/chartex" xmlns:cx2="http://schemas.microsoft.com/office/drawing/2015/10/21/chartex" xmlns:cx3="http://schemas.microsoft.com/office/drawing/2016/5/9/chartex" xmlns:cx4="http://schemas.microsoft.com/office/drawing/2016/5/10/chartex" xmlns:cx5="http://schemas.microsoft.com/office/drawing/2016/5/11/chartex" xmlns:cx6="http://schemas.microsoft.com/office/drawing/2016/5/12/chartex" xmlns:cx7="http://schemas.microsoft.com/office/drawing/2016/5/13/chartex" xmlns:cx8="http://schemas.microsoft.com/office/drawing/2016/5/14/chartex" xmlns:mc="http://schemas.openxmlformats.org/markup-compatibility/2006" xmlns:aink="http://schemas.microsoft.com/office/drawing/2016/ink" xmlns:am3d="http://schemas.microsoft.com/office/drawing/2017/model3d" xmlns:o="urn:schemas-microsoft-com:office:office" xmlns:r="http://schemas.openxmlformats.org/officeDocument/2006/relationships" xmlns:m="http://schemas.openxmlformats.org/officeDocument/2006/math" xmlns:v="urn:schemas-microsoft-com:vml" xmlns:wp14="http://schemas.microsoft.com/office/word/2010/wordprocessingDrawing" xmlns:wp="http://schemas.openxmlformats.org/drawingml/2006/wordprocessingDrawing" xmlns:w10="urn:schemas-microsoft-com:office:word" xmlns:w="http://schemas.openxmlformats.org/wordprocessingml/2006/main" xmlns:w14="http://schemas.microsoft.com/office/word/2010/wordml" xmlns:w15="http://schemas.microsoft.com/office/word/2012/wordml" xmlns:w16cex="http://schemas.microsoft.com/office/word/2018/wordml/cex" xmlns:w16cid="http://schemas.microsoft.com/office/word/2016/wordml/cid" xmlns:w16="http://schemas.microsoft.com/office/word/2018/wordml" xmlns:w16sdtdh="http://schemas.microsoft.com/office/word/2020/wordml/sdtdatahash" xmlns:w16se="http://schemas.microsoft.com/office/word/2015/wordml/symex" xmlns:wpg="http://schemas.microsoft.com/office/word/2010/wordprocessingGroup" xmlns:wpi="http://schemas.microsoft.com/office/word/2010/wordprocessingInk" xmlns:wne="http://schemas.microsoft.com/office/word/2006/wordml" xmlns:wps="http://schemas.microsoft.com/office/word/2010/wordprocessingShape" mc:Ignorable="w14 w15 w16se w16cid w16 w16cex w16sdtdh wp14">
+  <w:p>
+    <w:pPr>
+      <w:pStyle w:val="Header"/>
+    </w:pPr>
+  </w:p>
+</w:hdr>
+</file>
+
+<file path=word/header3.xml><?xml version="1.0" encoding="utf-8"?>
+<w:hdr xmlns:wpc="http://schemas.microsoft.com/office/word/2010/wordprocessingCanvas" xmlns:cx="http://schemas.microsoft.com/office/drawing/2014/chartex" xmlns:cx1="http://schemas.microsoft.com/office/drawing/2015/9/8/chartex" xmlns:cx2="http://schemas.microsoft.com/office/drawing/2015/10/21/chartex" xmlns:cx3="http://schemas.microsoft.com/office/drawing/2016/5/9/chartex" xmlns:cx4="http://schemas.microsoft.com/office/drawing/2016/5/10/chartex" xmlns:cx5="http://schemas.microsoft.com/office/drawing/2016/5/11/chartex" xmlns:cx6="http://schemas.microsoft.com/office/drawing/2016/5/12/chartex" xmlns:cx7="http://schemas.microsoft.com/office/drawing/2016/5/13/chartex" xmlns:cx8="http://schemas.microsoft.com/office/drawing/2016/5/14/chartex" xmlns:mc="http://schemas.openxmlformats.org/markup-compatibility/2006" xmlns:aink="http://schemas.microsoft.com/office/drawing/2016/ink" xmlns:am3d="http://schemas.microsoft.com/office/drawing/2017/model3d" xmlns:o="urn:schemas-microsoft-com:office:office" xmlns:r="http://schemas.openxmlformats.org/officeDocument/2006/relationships" xmlns:m="http://schemas.openxmlformats.org/officeDocument/2006/math" xmlns:v="urn:schemas-microsoft-com:vml" xmlns:wp14="http://schemas.microsoft.com/office/word/2010/wordprocessingDrawing" xmlns:wp="http://schemas.openxmlformats.org/drawingml/2006/wordprocessingDrawing" xmlns:w10="urn:schemas-microsoft-com:office:word" xmlns:w="http://schemas.openxmlformats.org/wordprocessingml/2006/main" xmlns:w14="http://schemas.microsoft.com/office/word/2010/wordml" xmlns:w15="http://schemas.microsoft.com/office/word/2012/wordml" xmlns:w16cex="http://schemas.microsoft.com/office/word/2018/wordml/cex" xmlns:w16cid="http://schemas.microsoft.com/office/word/2016/wordml/cid" xmlns:w16="http://schemas.microsoft.com/office/word/2018/wordml" xmlns:w16sdtdh="http://schemas.microsoft.com/office/word/2020/wordml/sdtdatahash" xmlns:w16se="http://schemas.microsoft.com/office/word/2015/wordml/symex" xmlns:wpg="http://schemas.microsoft.com/office/word/2010/wordprocessingGroup" xmlns:wpi="http://schemas.microsoft.com/office/word/2010/wordprocessingInk" xmlns:wne="http://schemas.microsoft.com/office/word/2006/wordml" xmlns:wps="http://schemas.microsoft.com/office/word/2010/wordprocessingShape" mc:Ignorable="w14 w15 w16se w16cid w16 w16cex w16sdtdh wp14">
+  <w:p>
+    <w:pPr>
+      <w:pStyle w:val="Header"/>
+    </w:pPr>
+  </w:p>
+</w:hdr>
 </file>
 
 <file path=word/numbering.xml><?xml version="1.0" encoding="utf-8"?>
@@ -3100,6 +3110,573 @@
 </w:styles>
 </file>
 
+<file path=word/glossary/document.xml><?xml version="1.0" encoding="utf-8"?>
+<w:glossaryDocument xmlns:wpc="http://schemas.microsoft.com/office/word/2010/wordprocessingCanvas" xmlns:cx="http://schemas.microsoft.com/office/drawing/2014/chartex" xmlns:cx1="http://schemas.microsoft.com/office/drawing/2015/9/8/chartex" xmlns:cx2="http://schemas.microsoft.com/office/drawing/2015/10/21/chartex" xmlns:cx3="http://schemas.microsoft.com/office/drawing/2016/5/9/chartex" xmlns:cx4="http://schemas.microsoft.com/office/drawing/2016/5/10/chartex" xmlns:cx5="http://schemas.microsoft.com/office/drawing/2016/5/11/chartex" xmlns:cx6="http://schemas.microsoft.com/office/drawing/2016/5/12/chartex" xmlns:cx7="http://schemas.microsoft.com/office/drawing/2016/5/13/chartex" xmlns:cx8="http://schemas.microsoft.com/office/drawing/2016/5/14/chartex" xmlns:mc="http://schemas.openxmlformats.org/markup-compatibility/2006" xmlns:aink="http://schemas.microsoft.com/office/drawing/2016/ink" xmlns:am3d="http://schemas.microsoft.com/office/drawing/2017/model3d" xmlns:o="urn:schemas-microsoft-com:office:office" xmlns:r="http://schemas.openxmlformats.org/officeDocument/2006/relationships" xmlns:m="http://schemas.openxmlformats.org/officeDocument/2006/math" xmlns:v="urn:schemas-microsoft-com:vml" xmlns:wp14="http://schemas.microsoft.com/office/word/2010/wordprocessingDrawing" xmlns:wp="http://schemas.openxmlformats.org/drawingml/2006/wordprocessingDrawing" xmlns:w10="urn:schemas-microsoft-com:office:word" xmlns:w="http://schemas.openxmlformats.org/wordprocessingml/2006/main" xmlns:w14="http://schemas.microsoft.com/office/word/2010/wordml" xmlns:w15="http://schemas.microsoft.com/office/word/2012/wordml" xmlns:w16cex="http://schemas.microsoft.com/office/word/2018/wordml/cex" xmlns:w16cid="http://schemas.microsoft.com/office/word/2016/wordml/cid" xmlns:w16="http://schemas.microsoft.com/office/word/2018/wordml" xmlns:w16sdtdh="http://schemas.microsoft.com/office/word/2020/wordml/sdtdatahash" xmlns:w16se="http://schemas.microsoft.com/office/word/2015/wordml/symex" xmlns:wpg="http://schemas.microsoft.com/office/word/2010/wordprocessingGroup" xmlns:wpi="http://schemas.microsoft.com/office/word/2010/wordprocessingInk" xmlns:wne="http://schemas.microsoft.com/office/word/2006/wordml" xmlns:wps="http://schemas.microsoft.com/office/word/2010/wordprocessingShape" mc:Ignorable="w14 w15 w16se w16cid w16 w16cex w16sdtdh wp14">
+  <w:docParts>
+    <w:docPart>
+      <w:docPartPr>
+        <w:name w:val="BC1A84D5C2E740B1A4E9102D7AFA3504"/>
+        <w:category>
+          <w:name w:val="General"/>
+          <w:gallery w:val="placeholder"/>
+        </w:category>
+        <w:types>
+          <w:type w:val="bbPlcHdr"/>
+        </w:types>
+        <w:behaviors>
+          <w:behavior w:val="content"/>
+        </w:behaviors>
+        <w:guid w:val="{0783F537-C4FD-4E2C-A1AA-ABC90B086313}"/>
+      </w:docPartPr>
+      <w:docPartBody>
+        <w:p>
+          <w:pPr>
+            <w:pStyle w:val="BC1A84D5C2E740B1A4E9102D7AFA3504"/>
+          </w:pPr>
+          <w:r>
+            <w:t>[Type here]</w:t>
+          </w:r>
+        </w:p>
+      </w:docPartBody>
+    </w:docPart>
+  </w:docParts>
+</w:glossaryDocument>
+</file>
+
+<file path=word/glossary/fontTable.xml><?xml version="1.0" encoding="utf-8"?>
+<w:fonts xmlns:mc="http://schemas.openxmlformats.org/markup-compatibility/2006" xmlns:r="http://schemas.openxmlformats.org/officeDocument/2006/relationships" xmlns:w="http://schemas.openxmlformats.org/wordprocessingml/2006/main" xmlns:w14="http://schemas.microsoft.com/office/word/2010/wordml" xmlns:w15="http://schemas.microsoft.com/office/word/2012/wordml" xmlns:w16cex="http://schemas.microsoft.com/office/word/2018/wordml/cex" xmlns:w16cid="http://schemas.microsoft.com/office/word/2016/wordml/cid" xmlns:w16="http://schemas.microsoft.com/office/word/2018/wordml" xmlns:w16sdtdh="http://schemas.microsoft.com/office/word/2020/wordml/sdtdatahash" xmlns:w16se="http://schemas.microsoft.com/office/word/2015/wordml/symex" mc:Ignorable="w14 w15 w16se w16cid w16 w16cex w16sdtdh">
+  <w:font w:name="Symbol">
+    <w:panose1 w:val="05050102010706020507"/>
+    <w:charset w:val="02"/>
+    <w:family w:val="roman"/>
+    <w:pitch w:val="variable"/>
+    <w:sig w:usb0="00000000" w:usb1="10000000" w:usb2="00000000" w:usb3="00000000" w:csb0="80000000" w:csb1="00000000"/>
+  </w:font>
+  <w:font w:name="Times New Roman">
+    <w:panose1 w:val="02020603050405020304"/>
+    <w:charset w:val="00"/>
+    <w:family w:val="roman"/>
+    <w:pitch w:val="variable"/>
+    <w:sig w:usb0="E0002EFF" w:usb1="C000785B" w:usb2="00000009" w:usb3="00000000" w:csb0="000001FF" w:csb1="00000000"/>
+  </w:font>
+  <w:font w:name="Wingdings">
+    <w:panose1 w:val="05000000000000000000"/>
+    <w:charset w:val="02"/>
+    <w:family w:val="auto"/>
+    <w:pitch w:val="variable"/>
+    <w:sig w:usb0="00000000" w:usb1="10000000" w:usb2="00000000" w:usb3="00000000" w:csb0="80000000" w:csb1="00000000"/>
+  </w:font>
+  <w:font w:name="Cambria">
+    <w:panose1 w:val="02040503050406030204"/>
+    <w:charset w:val="00"/>
+    <w:family w:val="roman"/>
+    <w:pitch w:val="variable"/>
+    <w:sig w:usb0="E00006FF" w:usb1="420024FF" w:usb2="02000000" w:usb3="00000000" w:csb0="0000019F" w:csb1="00000000"/>
+  </w:font>
+  <w:font w:name="Calibri">
+    <w:panose1 w:val="020F0502020204030204"/>
+    <w:charset w:val="00"/>
+    <w:family w:val="swiss"/>
+    <w:pitch w:val="variable"/>
+    <w:sig w:usb0="E4002EFF" w:usb1="C200247B" w:usb2="00000009" w:usb3="00000000" w:csb0="000001FF" w:csb1="00000000"/>
+  </w:font>
+  <w:font w:name="Consolas">
+    <w:panose1 w:val="020B0609020204030204"/>
+    <w:charset w:val="00"/>
+    <w:family w:val="modern"/>
+    <w:pitch w:val="fixed"/>
+    <w:sig w:usb0="E10006FF" w:usb1="4000FCFF" w:usb2="00000009" w:usb3="00000000" w:csb0="0000019F" w:csb1="00000000"/>
+  </w:font>
+  <w:font w:name="Calibri Light">
+    <w:panose1 w:val="020F0302020204030204"/>
+    <w:charset w:val="00"/>
+    <w:family w:val="swiss"/>
+    <w:pitch w:val="variable"/>
+    <w:sig w:usb0="E4002EFF" w:usb1="C200247B" w:usb2="00000009" w:usb3="00000000" w:csb0="000001FF" w:csb1="00000000"/>
+  </w:font>
+</w:fonts>
+</file>
+
+<file path=word/glossary/settings.xml><?xml version="1.0" encoding="utf-8"?>
+<w:settings xmlns:mc="http://schemas.openxmlformats.org/markup-compatibility/2006" xmlns:o="urn:schemas-microsoft-com:office:office" xmlns:r="http://schemas.openxmlformats.org/officeDocument/2006/relationships" xmlns:m="http://schemas.openxmlformats.org/officeDocument/2006/math" xmlns:v="urn:schemas-microsoft-com:vml" xmlns:w10="urn:schemas-microsoft-com:office:word" xmlns:w="http://schemas.openxmlformats.org/wordprocessingml/2006/main" xmlns:w14="http://schemas.microsoft.com/office/word/2010/wordml" xmlns:w15="http://schemas.microsoft.com/office/word/2012/wordml" xmlns:w16cex="http://schemas.microsoft.com/office/word/2018/wordml/cex" xmlns:w16cid="http://schemas.microsoft.com/office/word/2016/wordml/cid" xmlns:w16="http://schemas.microsoft.com/office/word/2018/wordml" xmlns:w16sdtdh="http://schemas.microsoft.com/office/word/2020/wordml/sdtdatahash" xmlns:w16se="http://schemas.microsoft.com/office/word/2015/wordml/symex" xmlns:sl="http://schemas.openxmlformats.org/schemaLibrary/2006/main" mc:Ignorable="w14 w15 w16se w16cid w16 w16cex w16sdtdh">
+  <w:view w:val="normal"/>
+  <w:defaultTabStop w:val="720"/>
+  <w:characterSpacingControl w:val="doNotCompress"/>
+  <w:compat>
+    <w:useFELayout/>
+    <w:compatSetting w:name="compatibilityMode" w:uri="http://schemas.microsoft.com/office/word" w:val="15"/>
+    <w:compatSetting w:name="overrideTableStyleFontSizeAndJustification" w:uri="http://schemas.microsoft.com/office/word" w:val="1"/>
+    <w:compatSetting w:name="enableOpenTypeFeatures" w:uri="http://schemas.microsoft.com/office/word" w:val="1"/>
+    <w:compatSetting w:name="doNotFlipMirrorIndents" w:uri="http://schemas.microsoft.com/office/word" w:val="1"/>
+    <w:compatSetting w:name="differentiateMultirowTableHeaders" w:uri="http://schemas.microsoft.com/office/word" w:val="1"/>
+    <w:compatSetting w:name="useWord2013TrackBottomHyphenation" w:uri="http://schemas.microsoft.com/office/word" w:val="0"/>
+  </w:compat>
+  <w:rsids>
+    <w:rsidRoot w:val="00A01595"/>
+    <w:rsid w:val="00375FC3"/>
+    <w:rsid w:val="00A01595"/>
+  </w:rsids>
+  <m:mathPr>
+    <m:mathFont m:val="Cambria Math"/>
+    <m:brkBin m:val="before"/>
+    <m:brkBinSub m:val="--"/>
+    <m:smallFrac m:val="0"/>
+    <m:dispDef/>
+    <m:lMargin m:val="0"/>
+    <m:rMargin m:val="0"/>
+    <m:defJc m:val="centerGroup"/>
+    <m:wrapIndent m:val="1440"/>
+    <m:intLim m:val="subSup"/>
+    <m:naryLim m:val="undOvr"/>
+  </m:mathPr>
+  <w:themeFontLang w:val="en-US"/>
+  <w:clrSchemeMapping w:bg1="light1" w:t1="dark1" w:bg2="light2" w:t2="dark2" w:accent1="accent1" w:accent2="accent2" w:accent3="accent3" w:accent4="accent4" w:accent5="accent5" w:accent6="accent6" w:hyperlink="hyperlink" w:followedHyperlink="followedHyperlink"/>
+  <w:decimalSymbol w:val="."/>
+  <w:listSeparator w:val=","/>
+  <w15:chartTrackingRefBased/>
+</w:settings>
+</file>
+
+<file path=word/glossary/styles.xml><?xml version="1.0" encoding="utf-8"?>
+<w:styles xmlns:mc="http://schemas.openxmlformats.org/markup-compatibility/2006" xmlns:r="http://schemas.openxmlformats.org/officeDocument/2006/relationships" xmlns:w="http://schemas.openxmlformats.org/wordprocessingml/2006/main" xmlns:w14="http://schemas.microsoft.com/office/word/2010/wordml" xmlns:w15="http://schemas.microsoft.com/office/word/2012/wordml" xmlns:w16cex="http://schemas.microsoft.com/office/word/2018/wordml/cex" xmlns:w16cid="http://schemas.microsoft.com/office/word/2016/wordml/cid" xmlns:w16="http://schemas.microsoft.com/office/word/2018/wordml" xmlns:w16sdtdh="http://schemas.microsoft.com/office/word/2020/wordml/sdtdatahash" xmlns:w16se="http://schemas.microsoft.com/office/word/2015/wordml/symex" mc:Ignorable="w14 w15 w16se w16cid w16 w16cex w16sdtdh">
+  <w:docDefaults>
+    <w:rPrDefault>
+      <w:rPr>
+        <w:rFonts w:asciiTheme="minorHAnsi" w:eastAsiaTheme="minorEastAsia" w:hAnsiTheme="minorHAnsi" w:cstheme="minorBidi"/>
+        <w:sz w:val="22"/>
+        <w:szCs w:val="22"/>
+        <w:lang w:val="en-US" w:eastAsia="en-US" w:bidi="ar-SA"/>
+      </w:rPr>
+    </w:rPrDefault>
+    <w:pPrDefault>
+      <w:pPr>
+        <w:spacing w:after="160" w:line="259" w:lineRule="auto"/>
+      </w:pPr>
+    </w:pPrDefault>
+  </w:docDefaults>
+  <w:latentStyles w:defLockedState="0" w:defUIPriority="99" w:defSemiHidden="0" w:defUnhideWhenUsed="0" w:defQFormat="0" w:count="376">
+    <w:lsdException w:name="Normal" w:uiPriority="0" w:qFormat="1"/>
+    <w:lsdException w:name="heading 1" w:uiPriority="9" w:qFormat="1"/>
+    <w:lsdException w:name="heading 2" w:semiHidden="1" w:uiPriority="9" w:unhideWhenUsed="1" w:qFormat="1"/>
+    <w:lsdException w:name="heading 3" w:semiHidden="1" w:uiPriority="9" w:unhideWhenUsed="1" w:qFormat="1"/>
+    <w:lsdException w:name="heading 4" w:semiHidden="1" w:uiPriority="9" w:unhideWhenUsed="1" w:qFormat="1"/>
+    <w:lsdException w:name="heading 5" w:semiHidden="1" w:uiPriority="9" w:unhideWhenUsed="1" w:qFormat="1"/>
+    <w:lsdException w:name="heading 6" w:semiHidden="1" w:uiPriority="9" w:unhideWhenUsed="1" w:qFormat="1"/>
+    <w:lsdException w:name="heading 7" w:semiHidden="1" w:uiPriority="9" w:unhideWhenUsed="1" w:qFormat="1"/>
+    <w:lsdException w:name="heading 8" w:semiHidden="1" w:uiPriority="9" w:unhideWhenUsed="1" w:qFormat="1"/>
+    <w:lsdException w:name="heading 9" w:semiHidden="1" w:uiPriority="9" w:unhideWhenUsed="1" w:qFormat="1"/>
+    <w:lsdException w:name="index 1" w:semiHidden="1" w:unhideWhenUsed="1"/>
+    <w:lsdException w:name="index 2" w:semiHidden="1" w:unhideWhenUsed="1"/>
+    <w:lsdException w:name="index 3" w:semiHidden="1" w:unhideWhenUsed="1"/>
+    <w:lsdException w:name="index 4" w:semiHidden="1" w:unhideWhenUsed="1"/>
+    <w:lsdException w:name="index 5" w:semiHidden="1" w:unhideWhenUsed="1"/>
+    <w:lsdException w:name="index 6" w:semiHidden="1" w:unhideWhenUsed="1"/>
+    <w:lsdException w:name="index 7" w:semiHidden="1" w:unhideWhenUsed="1"/>
+    <w:lsdException w:name="index 8" w:semiHidden="1" w:unhideWhenUsed="1"/>
+    <w:lsdException w:name="index 9" w:semiHidden="1" w:unhideWhenUsed="1"/>
+    <w:lsdException w:name="toc 1" w:semiHidden="1" w:uiPriority="39" w:unhideWhenUsed="1"/>
+    <w:lsdException w:name="toc 2" w:semiHidden="1" w:uiPriority="39" w:unhideWhenUsed="1"/>
+    <w:lsdException w:name="toc 3" w:semiHidden="1" w:uiPriority="39" w:unhideWhenUsed="1"/>
+    <w:lsdException w:name="toc 4" w:semiHidden="1" w:uiPriority="39" w:unhideWhenUsed="1"/>
+    <w:lsdException w:name="toc 5" w:semiHidden="1" w:uiPriority="39" w:unhideWhenUsed="1"/>
+    <w:lsdException w:name="toc 6" w:semiHidden="1" w:uiPriority="39" w:unhideWhenUsed="1"/>
+    <w:lsdException w:name="toc 7" w:semiHidden="1" w:uiPriority="39" w:unhideWhenUsed="1"/>
+    <w:lsdException w:name="toc 8" w:semiHidden="1" w:uiPriority="39" w:unhideWhenUsed="1"/>
+    <w:lsdException w:name="toc 9" w:semiHidden="1" w:uiPriority="39" w:unhideWhenUsed="1"/>
+    <w:lsdException w:name="Normal Indent" w:semiHidden="1" w:unhideWhenUsed="1"/>
+    <w:lsdException w:name="footnote text" w:semiHidden="1" w:unhideWhenUsed="1"/>
+    <w:lsdException w:name="annotation text" w:semiHidden="1" w:unhideWhenUsed="1"/>
+    <w:lsdException w:name="header" w:semiHidden="1" w:unhideWhenUsed="1"/>
+    <w:lsdException w:name="footer" w:semiHidden="1" w:unhideWhenUsed="1"/>
+    <w:lsdException w:name="index heading" w:semiHidden="1" w:unhideWhenUsed="1"/>
+    <w:lsdException w:name="caption" w:semiHidden="1" w:uiPriority="35" w:unhideWhenUsed="1" w:qFormat="1"/>
+    <w:lsdException w:name="table of figures" w:semiHidden="1" w:unhideWhenUsed="1"/>
+    <w:lsdException w:name="envelope address" w:semiHidden="1" w:unhideWhenUsed="1"/>
+    <w:lsdException w:name="envelope return" w:semiHidden="1" w:unhideWhenUsed="1"/>
+    <w:lsdException w:name="footnote reference" w:semiHidden="1" w:unhideWhenUsed="1"/>
+    <w:lsdException w:name="annotation reference" w:semiHidden="1" w:unhideWhenUsed="1"/>
+    <w:lsdException w:name="line number" w:semiHidden="1" w:unhideWhenUsed="1"/>
+    <w:lsdException w:name="page number" w:semiHidden="1" w:unhideWhenUsed="1"/>
+    <w:lsdException w:name="endnote reference" w:semiHidden="1" w:unhideWhenUsed="1"/>
+    <w:lsdException w:name="endnote text" w:semiHidden="1" w:unhideWhenUsed="1"/>
+    <w:lsdException w:name="table of authorities" w:semiHidden="1" w:unhideWhenUsed="1"/>
+    <w:lsdException w:name="macro" w:semiHidden="1" w:unhideWhenUsed="1"/>
+    <w:lsdException w:name="toa heading" w:semiHidden="1" w:unhideWhenUsed="1"/>
+    <w:lsdException w:name="List" w:semiHidden="1" w:unhideWhenUsed="1"/>
+    <w:lsdException w:name="List Bullet" w:semiHidden="1" w:unhideWhenUsed="1"/>
+    <w:lsdException w:name="List Number" w:semiHidden="1" w:unhideWhenUsed="1"/>
+    <w:lsdException w:name="List 2" w:semiHidden="1" w:unhideWhenUsed="1"/>
+    <w:lsdException w:name="List 3" w:semiHidden="1" w:unhideWhenUsed="1"/>
+    <w:lsdException w:name="List 4" w:semiHidden="1" w:unhideWhenUsed="1"/>
+    <w:lsdException w:name="List 5" w:semiHidden="1" w:unhideWhenUsed="1"/>
+    <w:lsdException w:name="List Bullet 2" w:semiHidden="1" w:unhideWhenUsed="1"/>
+    <w:lsdException w:name="List Bullet 3" w:semiHidden="1" w:unhideWhenUsed="1"/>
+    <w:lsdException w:name="List Bullet 4" w:semiHidden="1" w:unhideWhenUsed="1"/>
+    <w:lsdException w:name="List Bullet 5" w:semiHidden="1" w:unhideWhenUsed="1"/>
+    <w:lsdException w:name="List Number 2" w:semiHidden="1" w:unhideWhenUsed="1"/>
+    <w:lsdException w:name="List Number 3" w:semiHidden="1" w:unhideWhenUsed="1"/>
+    <w:lsdException w:name="List Number 4" w:semiHidden="1" w:unhideWhenUsed="1"/>
+    <w:lsdException w:name="List Number 5" w:semiHidden="1" w:unhideWhenUsed="1"/>
+    <w:lsdException w:name="Title" w:uiPriority="10" w:qFormat="1"/>
+    <w:lsdException w:name="Closing" w:semiHidden="1" w:unhideWhenUsed="1"/>
+    <w:lsdException w:name="Signature" w:semiHidden="1" w:unhideWhenUsed="1"/>
+    <w:lsdException w:name="Default Paragraph Font" w:semiHidden="1" w:uiPriority="1" w:unhideWhenUsed="1"/>
+    <w:lsdException w:name="Body Text" w:semiHidden="1" w:unhideWhenUsed="1"/>
+    <w:lsdException w:name="Body Text Indent" w:semiHidden="1" w:unhideWhenUsed="1"/>
+    <w:lsdException w:name="List Continue" w:semiHidden="1" w:unhideWhenUsed="1"/>
+    <w:lsdException w:name="List Continue 2" w:semiHidden="1" w:unhideWhenUsed="1"/>
+    <w:lsdException w:name="List Continue 3" w:semiHidden="1" w:unhideWhenUsed="1"/>
+    <w:lsdException w:name="List Continue 4" w:semiHidden="1" w:unhideWhenUsed="1"/>
+    <w:lsdException w:name="List Continue 5" w:semiHidden="1" w:unhideWhenUsed="1"/>
+    <w:lsdException w:name="Message Header" w:semiHidden="1" w:unhideWhenUsed="1"/>
+    <w:lsdException w:name="Subtitle" w:uiPriority="11" w:qFormat="1"/>
+    <w:lsdException w:name="Salutation" w:semiHidden="1" w:unhideWhenUsed="1"/>
+    <w:lsdException w:name="Date" w:semiHidden="1" w:unhideWhenUsed="1"/>
+    <w:lsdException w:name="Body Text First Indent" w:semiHidden="1" w:unhideWhenUsed="1"/>
+    <w:lsdException w:name="Body Text First Indent 2" w:semiHidden="1" w:unhideWhenUsed="1"/>
+    <w:lsdException w:name="Note Heading" w:semiHidden="1" w:unhideWhenUsed="1"/>
+    <w:lsdException w:name="Body Text 2" w:semiHidden="1" w:unhideWhenUsed="1"/>
+    <w:lsdException w:name="Body Text 3" w:semiHidden="1" w:unhideWhenUsed="1"/>
+    <w:lsdException w:name="Body Text Indent 2" w:semiHidden="1" w:unhideWhenUsed="1"/>
+    <w:lsdException w:name="Body Text Indent 3" w:semiHidden="1" w:unhideWhenUsed="1"/>
+    <w:lsdException w:name="Block Text" w:semiHidden="1" w:unhideWhenUsed="1"/>
+    <w:lsdException w:name="Hyperlink" w:semiHidden="1" w:unhideWhenUsed="1"/>
+    <w:lsdException w:name="FollowedHyperlink" w:semiHidden="1" w:unhideWhenUsed="1"/>
+    <w:lsdException w:name="Strong" w:uiPriority="22" w:qFormat="1"/>
+    <w:lsdException w:name="Emphasis" w:uiPriority="20" w:qFormat="1"/>
+    <w:lsdException w:name="Document Map" w:semiHidden="1" w:unhideWhenUsed="1"/>
+    <w:lsdException w:name="Plain Text" w:semiHidden="1" w:unhideWhenUsed="1"/>
+    <w:lsdException w:name="E-mail Signature" w:semiHidden="1" w:unhideWhenUsed="1"/>
+    <w:lsdException w:name="HTML Top of Form" w:semiHidden="1" w:unhideWhenUsed="1"/>
+    <w:lsdException w:name="HTML Bottom of Form" w:semiHidden="1" w:unhideWhenUsed="1"/>
+    <w:lsdException w:name="Normal (Web)" w:semiHidden="1" w:unhideWhenUsed="1"/>
+    <w:lsdException w:name="HTML Acronym" w:semiHidden="1" w:unhideWhenUsed="1"/>
+    <w:lsdException w:name="HTML Address" w:semiHidden="1" w:unhideWhenUsed="1"/>
+    <w:lsdException w:name="HTML Cite" w:semiHidden="1" w:unhideWhenUsed="1"/>
+    <w:lsdException w:name="HTML Code" w:semiHidden="1" w:unhideWhenUsed="1"/>
+    <w:lsdException w:name="HTML Definition" w:semiHidden="1" w:unhideWhenUsed="1"/>
+    <w:lsdException w:name="HTML Keyboard" w:semiHidden="1" w:unhideWhenUsed="1"/>
+    <w:lsdException w:name="HTML Preformatted" w:semiHidden="1" w:unhideWhenUsed="1"/>
+    <w:lsdException w:name="HTML Sample" w:semiHidden="1" w:unhideWhenUsed="1"/>
+    <w:lsdException w:name="HTML Typewriter" w:semiHidden="1" w:unhideWhenUsed="1"/>
+    <w:lsdException w:name="HTML Variable" w:semiHidden="1" w:unhideWhenUsed="1"/>
+    <w:lsdException w:name="Normal Table" w:semiHidden="1" w:unhideWhenUsed="1"/>
+    <w:lsdException w:name="annotation subject" w:semiHidden="1" w:unhideWhenUsed="1"/>
+    <w:lsdException w:name="No List" w:semiHidden="1" w:unhideWhenUsed="1"/>
+    <w:lsdException w:name="Outline List 1" w:semiHidden="1" w:unhideWhenUsed="1"/>
+    <w:lsdException w:name="Outline List 2" w:semiHidden="1" w:unhideWhenUsed="1"/>
+    <w:lsdException w:name="Outline List 3" w:semiHidden="1" w:unhideWhenUsed="1"/>
+    <w:lsdException w:name="Table Simple 1" w:semiHidden="1" w:unhideWhenUsed="1"/>
+    <w:lsdException w:name="Table Simple 2" w:semiHidden="1" w:unhideWhenUsed="1"/>
+    <w:lsdException w:name="Table Simple 3" w:semiHidden="1" w:unhideWhenUsed="1"/>
+    <w:lsdException w:name="Table Classic 1" w:semiHidden="1" w:unhideWhenUsed="1"/>
+    <w:lsdException w:name="Table Classic 2" w:semiHidden="1" w:unhideWhenUsed="1"/>
+    <w:lsdException w:name="Table Classic 3" w:semiHidden="1" w:unhideWhenUsed="1"/>
+    <w:lsdException w:name="Table Classic 4" w:semiHidden="1" w:unhideWhenUsed="1"/>
+    <w:lsdException w:name="Table Colorful 1" w:semiHidden="1" w:unhideWhenUsed="1"/>
+    <w:lsdException w:name="Table Colorful 2" w:semiHidden="1" w:unhideWhenUsed="1"/>
+    <w:lsdException w:name="Table Colorful 3" w:semiHidden="1" w:unhideWhenUsed="1"/>
+    <w:lsdException w:name="Table Columns 1" w:semiHidden="1" w:unhideWhenUsed="1"/>
+    <w:lsdException w:name="Table Columns 2" w:semiHidden="1" w:unhideWhenUsed="1"/>
+    <w:lsdException w:name="Table Columns 3" w:semiHidden="1" w:unhideWhenUsed="1"/>
+    <w:lsdException w:name="Table Columns 4" w:semiHidden="1" w:unhideWhenUsed="1"/>
+    <w:lsdException w:name="Table Columns 5" w:semiHidden="1" w:unhideWhenUsed="1"/>
+    <w:lsdException w:name="Table Grid 1" w:semiHidden="1" w:unhideWhenUsed="1"/>
+    <w:lsdException w:name="Table Grid 2" w:semiHidden="1" w:unhideWhenUsed="1"/>
+    <w:lsdException w:name="Table Grid 3" w:semiHidden="1" w:unhideWhenUsed="1"/>
+    <w:lsdException w:name="Table Grid 4" w:semiHidden="1" w:unhideWhenUsed="1"/>
+    <w:lsdException w:name="Table Grid 5" w:semiHidden="1" w:unhideWhenUsed="1"/>
+    <w:lsdException w:name="Table Grid 6" w:semiHidden="1" w:unhideWhenUsed="1"/>
+    <w:lsdException w:name="Table Grid 7" w:semiHidden="1" w:unhideWhenUsed="1"/>
+    <w:lsdException w:name="Table Grid 8" w:semiHidden="1" w:unhideWhenUsed="1"/>
+    <w:lsdException w:name="Table List 1" w:semiHidden="1" w:unhideWhenUsed="1"/>
+    <w:lsdException w:name="Table List 2" w:semiHidden="1" w:unhideWhenUsed="1"/>
+    <w:lsdException w:name="Table List 3" w:semiHidden="1" w:unhideWhenUsed="1"/>
+    <w:lsdException w:name="Table List 4" w:semiHidden="1" w:unhideWhenUsed="1"/>
+    <w:lsdException w:name="Table List 5" w:semiHidden="1" w:unhideWhenUsed="1"/>
+    <w:lsdException w:name="Table List 6" w:semiHidden="1" w:unhideWhenUsed="1"/>
+    <w:lsdException w:name="Table List 7" w:semiHidden="1" w:unhideWhenUsed="1"/>
+    <w:lsdException w:name="Table List 8" w:semiHidden="1" w:unhideWhenUsed="1"/>
+    <w:lsdException w:name="Table 3D effects 1" w:semiHidden="1" w:unhideWhenUsed="1"/>
+    <w:lsdException w:name="Table 3D effects 2" w:semiHidden="1" w:unhideWhenUsed="1"/>
+    <w:lsdException w:name="Table 3D effects 3" w:semiHidden="1" w:unhideWhenUsed="1"/>
+    <w:lsdException w:name="Table Contemporary" w:semiHidden="1" w:unhideWhenUsed="1"/>
+    <w:lsdException w:name="Table Elegant" w:semiHidden="1" w:unhideWhenUsed="1"/>
+    <w:lsdException w:name="Table Professional" w:semiHidden="1" w:unhideWhenUsed="1"/>
+    <w:lsdException w:name="Table Subtle 1" w:semiHidden="1" w:unhideWhenUsed="1"/>
+    <w:lsdException w:name="Table Subtle 2" w:semiHidden="1" w:unhideWhenUsed="1"/>
+    <w:lsdException w:name="Table Web 1" w:semiHidden="1" w:unhideWhenUsed="1"/>
+    <w:lsdException w:name="Table Web 2" w:semiHidden="1" w:unhideWhenUsed="1"/>
+    <w:lsdException w:name="Table Web 3" w:semiHidden="1" w:unhideWhenUsed="1"/>
+    <w:lsdException w:name="Balloon Text" w:semiHidden="1" w:unhideWhenUsed="1"/>
+    <w:lsdException w:name="Table Grid" w:uiPriority="39"/>
+    <w:lsdException w:name="Table Theme" w:semiHidden="1" w:unhideWhenUsed="1"/>
+    <w:lsdException w:name="Placeholder Text" w:semiHidden="1"/>
+    <w:lsdException w:name="No Spacing" w:uiPriority="1" w:qFormat="1"/>
+    <w:lsdException w:name="Light Shading" w:uiPriority="60"/>
+    <w:lsdException w:name="Light List" w:uiPriority="61"/>
+    <w:lsdException w:name="Light Grid" w:uiPriority="62"/>
+    <w:lsdException w:name="Medium Shading 1" w:uiPriority="63"/>
+    <w:lsdException w:name="Medium Shading 2" w:uiPriority="64"/>
+    <w:lsdException w:name="Medium List 1" w:uiPriority="65"/>
+    <w:lsdException w:name="Medium List 2" w:uiPriority="66"/>
+    <w:lsdException w:name="Medium Grid 1" w:uiPriority="67"/>
+    <w:lsdException w:name="Medium Grid 2" w:uiPriority="68"/>
+    <w:lsdException w:name="Medium Grid 3" w:uiPriority="69"/>
+    <w:lsdException w:name="Dark List" w:uiPriority="70"/>
+    <w:lsdException w:name="Colorful Shading" w:uiPriority="71"/>
+    <w:lsdException w:name="Colorful List" w:uiPriority="72"/>
+    <w:lsdException w:name="Colorful Grid" w:uiPriority="73"/>
+    <w:lsdException w:name="Light Shading Accent 1" w:uiPriority="60"/>
+    <w:lsdException w:name="Light List Accent 1" w:uiPriority="61"/>
+    <w:lsdException w:name="Light Grid Accent 1" w:uiPriority="62"/>
+    <w:lsdException w:name="Medium Shading 1 Accent 1" w:uiPriority="63"/>
+    <w:lsdException w:name="Medium Shading 2 Accent 1" w:uiPriority="64"/>
+    <w:lsdException w:name="Medium List 1 Accent 1" w:uiPriority="65"/>
+    <w:lsdException w:name="Revision" w:semiHidden="1"/>
+    <w:lsdException w:name="List Paragraph" w:uiPriority="34" w:qFormat="1"/>
+    <w:lsdException w:name="Quote" w:uiPriority="29" w:qFormat="1"/>
+    <w:lsdException w:name="Intense Quote" w:uiPriority="30" w:qFormat="1"/>
+    <w:lsdException w:name="Medium List 2 Accent 1" w:uiPriority="66"/>
+    <w:lsdException w:name="Medium Grid 1 Accent 1" w:uiPriority="67"/>
+    <w:lsdException w:name="Medium Grid 2 Accent 1" w:uiPriority="68"/>
+    <w:lsdException w:name="Medium Grid 3 Accent 1" w:uiPriority="69"/>
+    <w:lsdException w:name="Dark List Accent 1" w:uiPriority="70"/>
+    <w:lsdException w:name="Colorful Shading Accent 1" w:uiPriority="71"/>
+    <w:lsdException w:name="Colorful List Accent 1" w:uiPriority="72"/>
+    <w:lsdException w:name="Colorful Grid Accent 1" w:uiPriority="73"/>
+    <w:lsdException w:name="Light Shading Accent 2" w:uiPriority="60"/>
+    <w:lsdException w:name="Light List Accent 2" w:uiPriority="61"/>
+    <w:lsdException w:name="Light Grid Accent 2" w:uiPriority="62"/>
+    <w:lsdException w:name="Medium Shading 1 Accent 2" w:uiPriority="63"/>
+    <w:lsdException w:name="Medium Shading 2 Accent 2" w:uiPriority="64"/>
+    <w:lsdException w:name="Medium List 1 Accent 2" w:uiPriority="65"/>
+    <w:lsdException w:name="Medium List 2 Accent 2" w:uiPriority="66"/>
+    <w:lsdException w:name="Medium Grid 1 Accent 2" w:uiPriority="67"/>
+    <w:lsdException w:name="Medium Grid 2 Accent 2" w:uiPriority="68"/>
+    <w:lsdException w:name="Medium Grid 3 Accent 2" w:uiPriority="69"/>
+    <w:lsdException w:name="Dark List Accent 2" w:uiPriority="70"/>
+    <w:lsdException w:name="Colorful Shading Accent 2" w:uiPriority="71"/>
+    <w:lsdException w:name="Colorful List Accent 2" w:uiPriority="72"/>
+    <w:lsdException w:name="Colorful Grid Accent 2" w:uiPriority="73"/>
+    <w:lsdException w:name="Light Shading Accent 3" w:uiPriority="60"/>
+    <w:lsdException w:name="Light List Accent 3" w:uiPriority="61"/>
+    <w:lsdException w:name="Light Grid Accent 3" w:uiPriority="62"/>
+    <w:lsdException w:name="Medium Shading 1 Accent 3" w:uiPriority="63"/>
+    <w:lsdException w:name="Medium Shading 2 Accent 3" w:uiPriority="64"/>
+    <w:lsdException w:name="Medium List 1 Accent 3" w:uiPriority="65"/>
+    <w:lsdException w:name="Medium List 2 Accent 3" w:uiPriority="66"/>
+    <w:lsdException w:name="Medium Grid 1 Accent 3" w:uiPriority="67"/>
+    <w:lsdException w:name="Medium Grid 2 Accent 3" w:uiPriority="68"/>
+    <w:lsdException w:name="Medium Grid 3 Accent 3" w:uiPriority="69"/>
+    <w:lsdException w:name="Dark List Accent 3" w:uiPriority="70"/>
+    <w:lsdException w:name="Colorful Shading Accent 3" w:uiPriority="71"/>
+    <w:lsdException w:name="Colorful List Accent 3" w:uiPriority="72"/>
+    <w:lsdException w:name="Colorful Grid Accent 3" w:uiPriority="73"/>
+    <w:lsdException w:name="Light Shading Accent 4" w:uiPriority="60"/>
+    <w:lsdException w:name="Light List Accent 4" w:uiPriority="61"/>
+    <w:lsdException w:name="Light Grid Accent 4" w:uiPriority="62"/>
+    <w:lsdException w:name="Medium Shading 1 Accent 4" w:uiPriority="63"/>
+    <w:lsdException w:name="Medium Shading 2 Accent 4" w:uiPriority="64"/>
+    <w:lsdException w:name="Medium List 1 Accent 4" w:uiPriority="65"/>
+    <w:lsdException w:name="Medium List 2 Accent 4" w:uiPriority="66"/>
+    <w:lsdException w:name="Medium Grid 1 Accent 4" w:uiPriority="67"/>
+    <w:lsdException w:name="Medium Grid 2 Accent 4" w:uiPriority="68"/>
+    <w:lsdException w:name="Medium Grid 3 Accent 4" w:uiPriority="69"/>
+    <w:lsdException w:name="Dark List Accent 4" w:uiPriority="70"/>
+    <w:lsdException w:name="Colorful Shading Accent 4" w:uiPriority="71"/>
+    <w:lsdException w:name="Colorful List Accent 4" w:uiPriority="72"/>
+    <w:lsdException w:name="Colorful Grid Accent 4" w:uiPriority="73"/>
+    <w:lsdException w:name="Light Shading Accent 5" w:uiPriority="60"/>
+    <w:lsdException w:name="Light List Accent 5" w:uiPriority="61"/>
+    <w:lsdException w:name="Light Grid Accent 5" w:uiPriority="62"/>
+    <w:lsdException w:name="Medium Shading 1 Accent 5" w:uiPriority="63"/>
+    <w:lsdException w:name="Medium Shading 2 Accent 5" w:uiPriority="64"/>
+    <w:lsdException w:name="Medium List 1 Accent 5" w:uiPriority="65"/>
+    <w:lsdException w:name="Medium List 2 Accent 5" w:uiPriority="66"/>
+    <w:lsdException w:name="Medium Grid 1 Accent 5" w:uiPriority="67"/>
+    <w:lsdException w:name="Medium Grid 2 Accent 5" w:uiPriority="68"/>
+    <w:lsdException w:name="Medium Grid 3 Accent 5" w:uiPriority="69"/>
+    <w:lsdException w:name="Dark List Accent 5" w:uiPriority="70"/>
+    <w:lsdException w:name="Colorful Shading Accent 5" w:uiPriority="71"/>
+    <w:lsdException w:name="Colorful List Accent 5" w:uiPriority="72"/>
+    <w:lsdException w:name="Colorful Grid Accent 5" w:uiPriority="73"/>
+    <w:lsdException w:name="Light Shading Accent 6" w:uiPriority="60"/>
+    <w:lsdException w:name="Light List Accent 6" w:uiPriority="61"/>
+    <w:lsdException w:name="Light Grid Accent 6" w:uiPriority="62"/>
+    <w:lsdException w:name="Medium Shading 1 Accent 6" w:uiPriority="63"/>
+    <w:lsdException w:name="Medium Shading 2 Accent 6" w:uiPriority="64"/>
+    <w:lsdException w:name="Medium List 1 Accent 6" w:uiPriority="65"/>
+    <w:lsdException w:name="Medium List 2 Accent 6" w:uiPriority="66"/>
+    <w:lsdException w:name="Medium Grid 1 Accent 6" w:uiPriority="67"/>
+    <w:lsdException w:name="Medium Grid 2 Accent 6" w:uiPriority="68"/>
+    <w:lsdException w:name="Medium Grid 3 Accent 6" w:uiPriority="69"/>
+    <w:lsdException w:name="Dark List Accent 6" w:uiPriority="70"/>
+    <w:lsdException w:name="Colorful Shading Accent 6" w:uiPriority="71"/>
+    <w:lsdException w:name="Colorful List Accent 6" w:uiPriority="72"/>
+    <w:lsdException w:name="Colorful Grid Accent 6" w:uiPriority="73"/>
+    <w:lsdException w:name="Subtle Emphasis" w:uiPriority="19" w:qFormat="1"/>
+    <w:lsdException w:name="Intense Emphasis" w:uiPriority="21" w:qFormat="1"/>
+    <w:lsdException w:name="Subtle Reference" w:uiPriority="31" w:qFormat="1"/>
+    <w:lsdException w:name="Intense Reference" w:uiPriority="32" w:qFormat="1"/>
+    <w:lsdException w:name="Book Title" w:uiPriority="33" w:qFormat="1"/>
+    <w:lsdException w:name="Bibliography" w:semiHidden="1" w:uiPriority="37" w:unhideWhenUsed="1"/>
+    <w:lsdException w:name="TOC Heading" w:semiHidden="1" w:uiPriority="39" w:unhideWhenUsed="1" w:qFormat="1"/>
+    <w:lsdException w:name="Plain Table 1" w:uiPriority="41"/>
+    <w:lsdException w:name="Plain Table 2" w:uiPriority="42"/>
+    <w:lsdException w:name="Plain Table 3" w:uiPriority="43"/>
+    <w:lsdException w:name="Plain Table 4" w:uiPriority="44"/>
+    <w:lsdException w:name="Plain Table 5" w:uiPriority="45"/>
+    <w:lsdException w:name="Grid Table Light" w:uiPriority="40"/>
+    <w:lsdException w:name="Grid Table 1 Light" w:uiPriority="46"/>
+    <w:lsdException w:name="Grid Table 2" w:uiPriority="47"/>
+    <w:lsdException w:name="Grid Table 3" w:uiPriority="48"/>
+    <w:lsdException w:name="Grid Table 4" w:uiPriority="49"/>
+    <w:lsdException w:name="Grid Table 5 Dark" w:uiPriority="50"/>
+    <w:lsdException w:name="Grid Table 6 Colorful" w:uiPriority="51"/>
+    <w:lsdException w:name="Grid Table 7 Colorful" w:uiPriority="52"/>
+    <w:lsdException w:name="Grid Table 1 Light Accent 1" w:uiPriority="46"/>
+    <w:lsdException w:name="Grid Table 2 Accent 1" w:uiPriority="47"/>
+    <w:lsdException w:name="Grid Table 3 Accent 1" w:uiPriority="48"/>
+    <w:lsdException w:name="Grid Table 4 Accent 1" w:uiPriority="49"/>
+    <w:lsdException w:name="Grid Table 5 Dark Accent 1" w:uiPriority="50"/>
+    <w:lsdException w:name="Grid Table 6 Colorful Accent 1" w:uiPriority="51"/>
+    <w:lsdException w:name="Grid Table 7 Colorful Accent 1" w:uiPriority="52"/>
+    <w:lsdException w:name="Grid Table 1 Light Accent 2" w:uiPriority="46"/>
+    <w:lsdException w:name="Grid Table 2 Accent 2" w:uiPriority="47"/>
+    <w:lsdException w:name="Grid Table 3 Accent 2" w:uiPriority="48"/>
+    <w:lsdException w:name="Grid Table 4 Accent 2" w:uiPriority="49"/>
+    <w:lsdException w:name="Grid Table 5 Dark Accent 2" w:uiPriority="50"/>
+    <w:lsdException w:name="Grid Table 6 Colorful Accent 2" w:uiPriority="51"/>
+    <w:lsdException w:name="Grid Table 7 Colorful Accent 2" w:uiPriority="52"/>
+    <w:lsdException w:name="Grid Table 1 Light Accent 3" w:uiPriority="46"/>
+    <w:lsdException w:name="Grid Table 2 Accent 3" w:uiPriority="47"/>
+    <w:lsdException w:name="Grid Table 3 Accent 3" w:uiPriority="48"/>
+    <w:lsdException w:name="Grid Table 4 Accent 3" w:uiPriority="49"/>
+    <w:lsdException w:name="Grid Table 5 Dark Accent 3" w:uiPriority="50"/>
+    <w:lsdException w:name="Grid Table 6 Colorful Accent 3" w:uiPriority="51"/>
+    <w:lsdException w:name="Grid Table 7 Colorful Accent 3" w:uiPriority="52"/>
+    <w:lsdException w:name="Grid Table 1 Light Accent 4" w:uiPriority="46"/>
+    <w:lsdException w:name="Grid Table 2 Accent 4" w:uiPriority="47"/>
+    <w:lsdException w:name="Grid Table 3 Accent 4" w:uiPriority="48"/>
+    <w:lsdException w:name="Grid Table 4 Accent 4" w:uiPriority="49"/>
+    <w:lsdException w:name="Grid Table 5 Dark Accent 4" w:uiPriority="50"/>
+    <w:lsdException w:name="Grid Table 6 Colorful Accent 4" w:uiPriority="51"/>
+    <w:lsdException w:name="Grid Table 7 Colorful Accent 4" w:uiPriority="52"/>
+    <w:lsdException w:name="Grid Table 1 Light Accent 5" w:uiPriority="46"/>
+    <w:lsdException w:name="Grid Table 2 Accent 5" w:uiPriority="47"/>
+    <w:lsdException w:name="Grid Table 3 Accent 5" w:uiPriority="48"/>
+    <w:lsdException w:name="Grid Table 4 Accent 5" w:uiPriority="49"/>
+    <w:lsdException w:name="Grid Table 5 Dark Accent 5" w:uiPriority="50"/>
+    <w:lsdException w:name="Grid Table 6 Colorful Accent 5" w:uiPriority="51"/>
+    <w:lsdException w:name="Grid Table 7 Colorful Accent 5" w:uiPriority="52"/>
+    <w:lsdException w:name="Grid Table 1 Light Accent 6" w:uiPriority="46"/>
+    <w:lsdException w:name="Grid Table 2 Accent 6" w:uiPriority="47"/>
+    <w:lsdException w:name="Grid Table 3 Accent 6" w:uiPriority="48"/>
+    <w:lsdException w:name="Grid Table 4 Accent 6" w:uiPriority="49"/>
+    <w:lsdException w:name="Grid Table 5 Dark Accent 6" w:uiPriority="50"/>
+    <w:lsdException w:name="Grid Table 6 Colorful Accent 6" w:uiPriority="51"/>
+    <w:lsdException w:name="Grid Table 7 Colorful Accent 6" w:uiPriority="52"/>
+    <w:lsdException w:name="List Table 1 Light" w:uiPriority="46"/>
+    <w:lsdException w:name="List Table 2" w:uiPriority="47"/>
+    <w:lsdException w:name="List Table 3" w:uiPriority="48"/>
+    <w:lsdException w:name="List Table 4" w:uiPriority="49"/>
+    <w:lsdException w:name="List Table 5 Dark" w:uiPriority="50"/>
+    <w:lsdException w:name="List Table 6 Colorful" w:uiPriority="51"/>
+    <w:lsdException w:name="List Table 7 Colorful" w:uiPriority="52"/>
+    <w:lsdException w:name="List Table 1 Light Accent 1" w:uiPriority="46"/>
+    <w:lsdException w:name="List Table 2 Accent 1" w:uiPriority="47"/>
+    <w:lsdException w:name="List Table 3 Accent 1" w:uiPriority="48"/>
+    <w:lsdException w:name="List Table 4 Accent 1" w:uiPriority="49"/>
+    <w:lsdException w:name="List Table 5 Dark Accent 1" w:uiPriority="50"/>
+    <w:lsdException w:name="List Table 6 Colorful Accent 1" w:uiPriority="51"/>
+    <w:lsdException w:name="List Table 7 Colorful Accent 1" w:uiPriority="52"/>
+    <w:lsdException w:name="List Table 1 Light Accent 2" w:uiPriority="46"/>
+    <w:lsdException w:name="List Table 2 Accent 2" w:uiPriority="47"/>
+    <w:lsdException w:name="List Table 3 Accent 2" w:uiPriority="48"/>
+    <w:lsdException w:name="List Table 4 Accent 2" w:uiPriority="49"/>
+    <w:lsdException w:name="List Table 5 Dark Accent 2" w:uiPriority="50"/>
+    <w:lsdException w:name="List Table 6 Colorful Accent 2" w:uiPriority="51"/>
+    <w:lsdException w:name="List Table 7 Colorful Accent 2" w:uiPriority="52"/>
+    <w:lsdException w:name="List Table 1 Light Accent 3" w:uiPriority="46"/>
+    <w:lsdException w:name="List Table 2 Accent 3" w:uiPriority="47"/>
+    <w:lsdException w:name="List Table 3 Accent 3" w:uiPriority="48"/>
+    <w:lsdException w:name="List Table 4 Accent 3" w:uiPriority="49"/>
+    <w:lsdException w:name="List Table 5 Dark Accent 3" w:uiPriority="50"/>
+    <w:lsdException w:name="List Table 6 Colorful Accent 3" w:uiPriority="51"/>
+    <w:lsdException w:name="List Table 7 Colorful Accent 3" w:uiPriority="52"/>
+    <w:lsdException w:name="List Table 1 Light Accent 4" w:uiPriority="46"/>
+    <w:lsdException w:name="List Table 2 Accent 4" w:uiPriority="47"/>
+    <w:lsdException w:name="List Table 3 Accent 4" w:uiPriority="48"/>
+    <w:lsdException w:name="List Table 4 Accent 4" w:uiPriority="49"/>
+    <w:lsdException w:name="List Table 5 Dark Accent 4" w:uiPriority="50"/>
+    <w:lsdException w:name="List Table 6 Colorful Accent 4" w:uiPriority="51"/>
+    <w:lsdException w:name="List Table 7 Colorful Accent 4" w:uiPriority="52"/>
+    <w:lsdException w:name="List Table 1 Light Accent 5" w:uiPriority="46"/>
+    <w:lsdException w:name="List Table 2 Accent 5" w:uiPriority="47"/>
+    <w:lsdException w:name="List Table 3 Accent 5" w:uiPriority="48"/>
+    <w:lsdException w:name="List Table 4 Accent 5" w:uiPriority="49"/>
+    <w:lsdException w:name="List Table 5 Dark Accent 5" w:uiPriority="50"/>
+    <w:lsdException w:name="List Table 6 Colorful Accent 5" w:uiPriority="51"/>
+    <w:lsdException w:name="List Table 7 Colorful Accent 5" w:uiPriority="52"/>
+    <w:lsdException w:name="List Table 1 Light Accent 6" w:uiPriority="46"/>
+    <w:lsdException w:name="List Table 2 Accent 6" w:uiPriority="47"/>
+    <w:lsdException w:name="List Table 3 Accent 6" w:uiPriority="48"/>
+    <w:lsdException w:name="List Table 4 Accent 6" w:uiPriority="49"/>
+    <w:lsdException w:name="List Table 5 Dark Accent 6" w:uiPriority="50"/>
+    <w:lsdException w:name="List Table 6 Colorful Accent 6" w:uiPriority="51"/>
+    <w:lsdException w:name="List Table 7 Colorful Accent 6" w:uiPriority="52"/>
+    <w:lsdException w:name="Mention" w:semiHidden="1" w:unhideWhenUsed="1"/>
+    <w:lsdException w:name="Smart Hyperlink" w:semiHidden="1" w:unhideWhenUsed="1"/>
+    <w:lsdException w:name="Hashtag" w:semiHidden="1" w:unhideWhenUsed="1"/>
+    <w:lsdException w:name="Unresolved Mention" w:semiHidden="1" w:unhideWhenUsed="1"/>
+    <w:lsdException w:name="Smart Link" w:semiHidden="1" w:unhideWhenUsed="1"/>
+  </w:latentStyles>
+  <w:style w:type="paragraph" w:default="1" w:styleId="Normal">
+    <w:name w:val="Normal"/>
+    <w:qFormat/>
+  </w:style>
+  <w:style w:type="character" w:default="1" w:styleId="DefaultParagraphFont">
+    <w:name w:val="Default Paragraph Font"/>
+    <w:uiPriority w:val="1"/>
+    <w:semiHidden/>
+    <w:unhideWhenUsed/>
+  </w:style>
+  <w:style w:type="table" w:default="1" w:styleId="TableNormal">
+    <w:name w:val="Normal Table"/>
+    <w:uiPriority w:val="99"/>
+    <w:semiHidden/>
+    <w:unhideWhenUsed/>
+    <w:tblPr>
+      <w:tblInd w:w="0" w:type="dxa"/>
+      <w:tblCellMar>
+        <w:top w:w="0" w:type="dxa"/>
+        <w:left w:w="108" w:type="dxa"/>
+        <w:bottom w:w="0" w:type="dxa"/>
+        <w:right w:w="108" w:type="dxa"/>
+      </w:tblCellMar>
+    </w:tblPr>
+  </w:style>
+  <w:style w:type="numbering" w:default="1" w:styleId="NoList">
+    <w:name w:val="No List"/>
+    <w:uiPriority w:val="99"/>
+    <w:semiHidden/>
+    <w:unhideWhenUsed/>
+  </w:style>
+  <w:style w:type="paragraph" w:customStyle="1" w:styleId="BC1A84D5C2E740B1A4E9102D7AFA3504">
+    <w:name w:val="BC1A84D5C2E740B1A4E9102D7AFA3504"/>
+    <w:rsid w:val="00A01595"/>
+  </w:style>
+</w:styles>
+</file>
+
+<file path=word/glossary/webSettings.xml><?xml version="1.0" encoding="utf-8"?>
+<w:webSettings xmlns:mc="http://schemas.openxmlformats.org/markup-compatibility/2006" xmlns:r="http://schemas.openxmlformats.org/officeDocument/2006/relationships" xmlns:w="http://schemas.openxmlformats.org/wordprocessingml/2006/main" xmlns:w14="http://schemas.microsoft.com/office/word/2010/wordml" xmlns:w15="http://schemas.microsoft.com/office/word/2012/wordml" xmlns:w16cex="http://schemas.microsoft.com/office/word/2018/wordml/cex" xmlns:w16cid="http://schemas.microsoft.com/office/word/2016/wordml/cid" xmlns:w16="http://schemas.microsoft.com/office/word/2018/wordml" xmlns:w16sdtdh="http://schemas.microsoft.com/office/word/2020/wordml/sdtdatahash" xmlns:w16se="http://schemas.microsoft.com/office/word/2015/wordml/symex" mc:Ignorable="w14 w15 w16se w16cid w16 w16cex w16sdtdh">
+  <w:optimizeForBrowser/>
+  <w:allowPNG/>
+</w:webSettings>
+</file>
+
 <file path=word/theme/theme1.xml><?xml version="1.0" encoding="utf-8"?>
 <a:theme xmlns:a="http://schemas.openxmlformats.org/drawingml/2006/main" name="Office Theme">
   <a:themeElements>

</xml_diff>

<commit_message>
With a few new references
</commit_message>
<xml_diff>
--- a/reference_template.docx
+++ b/reference_template.docx
@@ -9,12 +9,8 @@
       </w:pPr>
     </w:p>
     <w:sectPr>
-      <w:headerReference w:type="even" r:id="rId8"/>
-      <w:headerReference w:type="default" r:id="rId9"/>
-      <w:footerReference w:type="even" r:id="rId10"/>
-      <w:footerReference w:type="default" r:id="rId11"/>
-      <w:headerReference w:type="first" r:id="rId12"/>
-      <w:footerReference w:type="first" r:id="rId13"/>
+      <w:footerReference w:type="even" r:id="rId8"/>
+      <w:footerReference w:type="default" r:id="rId9"/>
       <w:pgSz w:w="12240" w:h="15840"/>
       <w:pgMar w:top="1417" w:right="1417" w:bottom="1417" w:left="1417" w:header="720" w:footer="720" w:gutter="0"/>
       <w:lnNumType w:countBy="1" w:restart="continuous"/>
@@ -111,25 +107,45 @@
 <w:ftr xmlns:wpc="http://schemas.microsoft.com/office/word/2010/wordprocessingCanvas" xmlns:cx="http://schemas.microsoft.com/office/drawing/2014/chartex" xmlns:cx1="http://schemas.microsoft.com/office/drawing/2015/9/8/chartex" xmlns:cx2="http://schemas.microsoft.com/office/drawing/2015/10/21/chartex" xmlns:cx3="http://schemas.microsoft.com/office/drawing/2016/5/9/chartex" xmlns:cx4="http://schemas.microsoft.com/office/drawing/2016/5/10/chartex" xmlns:cx5="http://schemas.microsoft.com/office/drawing/2016/5/11/chartex" xmlns:cx6="http://schemas.microsoft.com/office/drawing/2016/5/12/chartex" xmlns:cx7="http://schemas.microsoft.com/office/drawing/2016/5/13/chartex" xmlns:cx8="http://schemas.microsoft.com/office/drawing/2016/5/14/chartex" xmlns:mc="http://schemas.openxmlformats.org/markup-compatibility/2006" xmlns:aink="http://schemas.microsoft.com/office/drawing/2016/ink" xmlns:am3d="http://schemas.microsoft.com/office/drawing/2017/model3d" xmlns:o="urn:schemas-microsoft-com:office:office" xmlns:r="http://schemas.openxmlformats.org/officeDocument/2006/relationships" xmlns:m="http://schemas.openxmlformats.org/officeDocument/2006/math" xmlns:v="urn:schemas-microsoft-com:vml" xmlns:wp14="http://schemas.microsoft.com/office/word/2010/wordprocessingDrawing" xmlns:wp="http://schemas.openxmlformats.org/drawingml/2006/wordprocessingDrawing" xmlns:w10="urn:schemas-microsoft-com:office:word" xmlns:w="http://schemas.openxmlformats.org/wordprocessingml/2006/main" xmlns:w14="http://schemas.microsoft.com/office/word/2010/wordml" xmlns:w15="http://schemas.microsoft.com/office/word/2012/wordml" xmlns:w16cex="http://schemas.microsoft.com/office/word/2018/wordml/cex" xmlns:w16cid="http://schemas.microsoft.com/office/word/2016/wordml/cid" xmlns:w16="http://schemas.microsoft.com/office/word/2018/wordml" xmlns:w16sdtdh="http://schemas.microsoft.com/office/word/2020/wordml/sdtdatahash" xmlns:w16se="http://schemas.microsoft.com/office/word/2015/wordml/symex" xmlns:wpg="http://schemas.microsoft.com/office/word/2010/wordprocessingGroup" xmlns:wpi="http://schemas.microsoft.com/office/word/2010/wordprocessingInk" xmlns:wne="http://schemas.microsoft.com/office/word/2006/wordml" xmlns:wps="http://schemas.microsoft.com/office/word/2010/wordprocessingShape" mc:Ignorable="w14 w15 w16se w16cid w16 w16cex w16sdtdh wp14">
   <w:sdt>
     <w:sdtPr>
-      <w:id w:val="969169713"/>
-      <w:placeholder>
-        <w:docPart w:val="BC1A84D5C2E740B1A4E9102D7AFA3504"/>
-      </w:placeholder>
-      <w:temporary/>
-      <w:showingPlcHdr/>
-      <w15:appearance w15:val="hidden"/>
+      <w:id w:val="1335264019"/>
+      <w:docPartObj>
+        <w:docPartGallery w:val="Page Numbers (Bottom of Page)"/>
+        <w:docPartUnique/>
+      </w:docPartObj>
     </w:sdtPr>
+    <w:sdtEndPr>
+      <w:rPr>
+        <w:noProof/>
+        <w:sz w:val="20"/>
+        <w:szCs w:val="20"/>
+      </w:rPr>
+    </w:sdtEndPr>
     <w:sdtContent>
       <w:p>
         <w:pPr>
           <w:pStyle w:val="Footer"/>
+          <w:jc w:val="center"/>
         </w:pPr>
         <w:r>
+          <w:fldChar w:fldCharType="begin"/>
+        </w:r>
+        <w:r>
+          <w:instrText xml:space="preserve"> PAGE   \* MERGEFORMAT </w:instrText>
+        </w:r>
+        <w:r>
+          <w:fldChar w:fldCharType="separate"/>
+        </w:r>
+        <w:r>
           <w:rPr>
-            <w:sz w:val="18"/>
-            <w:szCs w:val="18"/>
+            <w:noProof/>
           </w:rPr>
-          <w:t>[Type here]</w:t>
+          <w:t>2</w:t>
+        </w:r>
+        <w:r>
+          <w:rPr>
+            <w:noProof/>
+          </w:rPr>
+          <w:fldChar w:fldCharType="end"/>
         </w:r>
       </w:p>
     </w:sdtContent>
@@ -137,17 +153,11 @@
   <w:p>
     <w:pPr>
       <w:pStyle w:val="Footer"/>
-      <w:ind w:right="360" w:firstLine="360"/>
-    </w:pPr>
-  </w:p>
-</w:ftr>
-</file>
-
-<file path=word/footer3.xml><?xml version="1.0" encoding="utf-8"?>
-<w:ftr xmlns:wpc="http://schemas.microsoft.com/office/word/2010/wordprocessingCanvas" xmlns:cx="http://schemas.microsoft.com/office/drawing/2014/chartex" xmlns:cx1="http://schemas.microsoft.com/office/drawing/2015/9/8/chartex" xmlns:cx2="http://schemas.microsoft.com/office/drawing/2015/10/21/chartex" xmlns:cx3="http://schemas.microsoft.com/office/drawing/2016/5/9/chartex" xmlns:cx4="http://schemas.microsoft.com/office/drawing/2016/5/10/chartex" xmlns:cx5="http://schemas.microsoft.com/office/drawing/2016/5/11/chartex" xmlns:cx6="http://schemas.microsoft.com/office/drawing/2016/5/12/chartex" xmlns:cx7="http://schemas.microsoft.com/office/drawing/2016/5/13/chartex" xmlns:cx8="http://schemas.microsoft.com/office/drawing/2016/5/14/chartex" xmlns:mc="http://schemas.openxmlformats.org/markup-compatibility/2006" xmlns:aink="http://schemas.microsoft.com/office/drawing/2016/ink" xmlns:am3d="http://schemas.microsoft.com/office/drawing/2017/model3d" xmlns:o="urn:schemas-microsoft-com:office:office" xmlns:r="http://schemas.openxmlformats.org/officeDocument/2006/relationships" xmlns:m="http://schemas.openxmlformats.org/officeDocument/2006/math" xmlns:v="urn:schemas-microsoft-com:vml" xmlns:wp14="http://schemas.microsoft.com/office/word/2010/wordprocessingDrawing" xmlns:wp="http://schemas.openxmlformats.org/drawingml/2006/wordprocessingDrawing" xmlns:w10="urn:schemas-microsoft-com:office:word" xmlns:w="http://schemas.openxmlformats.org/wordprocessingml/2006/main" xmlns:w14="http://schemas.microsoft.com/office/word/2010/wordml" xmlns:w15="http://schemas.microsoft.com/office/word/2012/wordml" xmlns:w16cex="http://schemas.microsoft.com/office/word/2018/wordml/cex" xmlns:w16cid="http://schemas.microsoft.com/office/word/2016/wordml/cid" xmlns:w16="http://schemas.microsoft.com/office/word/2018/wordml" xmlns:w16sdtdh="http://schemas.microsoft.com/office/word/2020/wordml/sdtdatahash" xmlns:w16se="http://schemas.microsoft.com/office/word/2015/wordml/symex" xmlns:wpg="http://schemas.microsoft.com/office/word/2010/wordprocessingGroup" xmlns:wpi="http://schemas.microsoft.com/office/word/2010/wordprocessingInk" xmlns:wne="http://schemas.microsoft.com/office/word/2006/wordml" xmlns:wps="http://schemas.microsoft.com/office/word/2010/wordprocessingShape" mc:Ignorable="w14 w15 w16se w16cid w16 w16cex w16sdtdh wp14">
-  <w:p>
-    <w:pPr>
-      <w:pStyle w:val="Footer"/>
+      <w:ind w:right="360"/>
+      <w:rPr>
+        <w:sz w:val="18"/>
+        <w:szCs w:val="18"/>
+      </w:rPr>
     </w:pPr>
   </w:p>
 </w:ftr>
@@ -176,36 +186,6 @@
     </w:p>
   </w:footnote>
 </w:footnotes>
-</file>
-
-<file path=word/header1.xml><?xml version="1.0" encoding="utf-8"?>
-<w:hdr xmlns:wpc="http://schemas.microsoft.com/office/word/2010/wordprocessingCanvas" xmlns:cx="http://schemas.microsoft.com/office/drawing/2014/chartex" xmlns:cx1="http://schemas.microsoft.com/office/drawing/2015/9/8/chartex" xmlns:cx2="http://schemas.microsoft.com/office/drawing/2015/10/21/chartex" xmlns:cx3="http://schemas.microsoft.com/office/drawing/2016/5/9/chartex" xmlns:cx4="http://schemas.microsoft.com/office/drawing/2016/5/10/chartex" xmlns:cx5="http://schemas.microsoft.com/office/drawing/2016/5/11/chartex" xmlns:cx6="http://schemas.microsoft.com/office/drawing/2016/5/12/chartex" xmlns:cx7="http://schemas.microsoft.com/office/drawing/2016/5/13/chartex" xmlns:cx8="http://schemas.microsoft.com/office/drawing/2016/5/14/chartex" xmlns:mc="http://schemas.openxmlformats.org/markup-compatibility/2006" xmlns:aink="http://schemas.microsoft.com/office/drawing/2016/ink" xmlns:am3d="http://schemas.microsoft.com/office/drawing/2017/model3d" xmlns:o="urn:schemas-microsoft-com:office:office" xmlns:r="http://schemas.openxmlformats.org/officeDocument/2006/relationships" xmlns:m="http://schemas.openxmlformats.org/officeDocument/2006/math" xmlns:v="urn:schemas-microsoft-com:vml" xmlns:wp14="http://schemas.microsoft.com/office/word/2010/wordprocessingDrawing" xmlns:wp="http://schemas.openxmlformats.org/drawingml/2006/wordprocessingDrawing" xmlns:w10="urn:schemas-microsoft-com:office:word" xmlns:w="http://schemas.openxmlformats.org/wordprocessingml/2006/main" xmlns:w14="http://schemas.microsoft.com/office/word/2010/wordml" xmlns:w15="http://schemas.microsoft.com/office/word/2012/wordml" xmlns:w16cex="http://schemas.microsoft.com/office/word/2018/wordml/cex" xmlns:w16cid="http://schemas.microsoft.com/office/word/2016/wordml/cid" xmlns:w16="http://schemas.microsoft.com/office/word/2018/wordml" xmlns:w16sdtdh="http://schemas.microsoft.com/office/word/2020/wordml/sdtdatahash" xmlns:w16se="http://schemas.microsoft.com/office/word/2015/wordml/symex" xmlns:wpg="http://schemas.microsoft.com/office/word/2010/wordprocessingGroup" xmlns:wpi="http://schemas.microsoft.com/office/word/2010/wordprocessingInk" xmlns:wne="http://schemas.microsoft.com/office/word/2006/wordml" xmlns:wps="http://schemas.microsoft.com/office/word/2010/wordprocessingShape" mc:Ignorable="w14 w15 w16se w16cid w16 w16cex w16sdtdh wp14">
-  <w:p>
-    <w:pPr>
-      <w:pStyle w:val="Header"/>
-    </w:pPr>
-  </w:p>
-</w:hdr>
-</file>
-
-<file path=word/header2.xml><?xml version="1.0" encoding="utf-8"?>
-<w:hdr xmlns:wpc="http://schemas.microsoft.com/office/word/2010/wordprocessingCanvas" xmlns:cx="http://schemas.microsoft.com/office/drawing/2014/chartex" xmlns:cx1="http://schemas.microsoft.com/office/drawing/2015/9/8/chartex" xmlns:cx2="http://schemas.microsoft.com/office/drawing/2015/10/21/chartex" xmlns:cx3="http://schemas.microsoft.com/office/drawing/2016/5/9/chartex" xmlns:cx4="http://schemas.microsoft.com/office/drawing/2016/5/10/chartex" xmlns:cx5="http://schemas.microsoft.com/office/drawing/2016/5/11/chartex" xmlns:cx6="http://schemas.microsoft.com/office/drawing/2016/5/12/chartex" xmlns:cx7="http://schemas.microsoft.com/office/drawing/2016/5/13/chartex" xmlns:cx8="http://schemas.microsoft.com/office/drawing/2016/5/14/chartex" xmlns:mc="http://schemas.openxmlformats.org/markup-compatibility/2006" xmlns:aink="http://schemas.microsoft.com/office/drawing/2016/ink" xmlns:am3d="http://schemas.microsoft.com/office/drawing/2017/model3d" xmlns:o="urn:schemas-microsoft-com:office:office" xmlns:r="http://schemas.openxmlformats.org/officeDocument/2006/relationships" xmlns:m="http://schemas.openxmlformats.org/officeDocument/2006/math" xmlns:v="urn:schemas-microsoft-com:vml" xmlns:wp14="http://schemas.microsoft.com/office/word/2010/wordprocessingDrawing" xmlns:wp="http://schemas.openxmlformats.org/drawingml/2006/wordprocessingDrawing" xmlns:w10="urn:schemas-microsoft-com:office:word" xmlns:w="http://schemas.openxmlformats.org/wordprocessingml/2006/main" xmlns:w14="http://schemas.microsoft.com/office/word/2010/wordml" xmlns:w15="http://schemas.microsoft.com/office/word/2012/wordml" xmlns:w16cex="http://schemas.microsoft.com/office/word/2018/wordml/cex" xmlns:w16cid="http://schemas.microsoft.com/office/word/2016/wordml/cid" xmlns:w16="http://schemas.microsoft.com/office/word/2018/wordml" xmlns:w16sdtdh="http://schemas.microsoft.com/office/word/2020/wordml/sdtdatahash" xmlns:w16se="http://schemas.microsoft.com/office/word/2015/wordml/symex" xmlns:wpg="http://schemas.microsoft.com/office/word/2010/wordprocessingGroup" xmlns:wpi="http://schemas.microsoft.com/office/word/2010/wordprocessingInk" xmlns:wne="http://schemas.microsoft.com/office/word/2006/wordml" xmlns:wps="http://schemas.microsoft.com/office/word/2010/wordprocessingShape" mc:Ignorable="w14 w15 w16se w16cid w16 w16cex w16sdtdh wp14">
-  <w:p>
-    <w:pPr>
-      <w:pStyle w:val="Header"/>
-    </w:pPr>
-  </w:p>
-</w:hdr>
-</file>
-
-<file path=word/header3.xml><?xml version="1.0" encoding="utf-8"?>
-<w:hdr xmlns:wpc="http://schemas.microsoft.com/office/word/2010/wordprocessingCanvas" xmlns:cx="http://schemas.microsoft.com/office/drawing/2014/chartex" xmlns:cx1="http://schemas.microsoft.com/office/drawing/2015/9/8/chartex" xmlns:cx2="http://schemas.microsoft.com/office/drawing/2015/10/21/chartex" xmlns:cx3="http://schemas.microsoft.com/office/drawing/2016/5/9/chartex" xmlns:cx4="http://schemas.microsoft.com/office/drawing/2016/5/10/chartex" xmlns:cx5="http://schemas.microsoft.com/office/drawing/2016/5/11/chartex" xmlns:cx6="http://schemas.microsoft.com/office/drawing/2016/5/12/chartex" xmlns:cx7="http://schemas.microsoft.com/office/drawing/2016/5/13/chartex" xmlns:cx8="http://schemas.microsoft.com/office/drawing/2016/5/14/chartex" xmlns:mc="http://schemas.openxmlformats.org/markup-compatibility/2006" xmlns:aink="http://schemas.microsoft.com/office/drawing/2016/ink" xmlns:am3d="http://schemas.microsoft.com/office/drawing/2017/model3d" xmlns:o="urn:schemas-microsoft-com:office:office" xmlns:r="http://schemas.openxmlformats.org/officeDocument/2006/relationships" xmlns:m="http://schemas.openxmlformats.org/officeDocument/2006/math" xmlns:v="urn:schemas-microsoft-com:vml" xmlns:wp14="http://schemas.microsoft.com/office/word/2010/wordprocessingDrawing" xmlns:wp="http://schemas.openxmlformats.org/drawingml/2006/wordprocessingDrawing" xmlns:w10="urn:schemas-microsoft-com:office:word" xmlns:w="http://schemas.openxmlformats.org/wordprocessingml/2006/main" xmlns:w14="http://schemas.microsoft.com/office/word/2010/wordml" xmlns:w15="http://schemas.microsoft.com/office/word/2012/wordml" xmlns:w16cex="http://schemas.microsoft.com/office/word/2018/wordml/cex" xmlns:w16cid="http://schemas.microsoft.com/office/word/2016/wordml/cid" xmlns:w16="http://schemas.microsoft.com/office/word/2018/wordml" xmlns:w16sdtdh="http://schemas.microsoft.com/office/word/2020/wordml/sdtdatahash" xmlns:w16se="http://schemas.microsoft.com/office/word/2015/wordml/symex" xmlns:wpg="http://schemas.microsoft.com/office/word/2010/wordprocessingGroup" xmlns:wpi="http://schemas.microsoft.com/office/word/2010/wordprocessingInk" xmlns:wne="http://schemas.microsoft.com/office/word/2006/wordml" xmlns:wps="http://schemas.microsoft.com/office/word/2010/wordprocessingShape" mc:Ignorable="w14 w15 w16se w16cid w16 w16cex w16sdtdh wp14">
-  <w:p>
-    <w:pPr>
-      <w:pStyle w:val="Header"/>
-    </w:pPr>
-  </w:p>
-</w:hdr>
 </file>
 
 <file path=word/numbering.xml><?xml version="1.0" encoding="utf-8"?>
@@ -3110,573 +3090,6 @@
 </w:styles>
 </file>
 
-<file path=word/glossary/document.xml><?xml version="1.0" encoding="utf-8"?>
-<w:glossaryDocument xmlns:wpc="http://schemas.microsoft.com/office/word/2010/wordprocessingCanvas" xmlns:cx="http://schemas.microsoft.com/office/drawing/2014/chartex" xmlns:cx1="http://schemas.microsoft.com/office/drawing/2015/9/8/chartex" xmlns:cx2="http://schemas.microsoft.com/office/drawing/2015/10/21/chartex" xmlns:cx3="http://schemas.microsoft.com/office/drawing/2016/5/9/chartex" xmlns:cx4="http://schemas.microsoft.com/office/drawing/2016/5/10/chartex" xmlns:cx5="http://schemas.microsoft.com/office/drawing/2016/5/11/chartex" xmlns:cx6="http://schemas.microsoft.com/office/drawing/2016/5/12/chartex" xmlns:cx7="http://schemas.microsoft.com/office/drawing/2016/5/13/chartex" xmlns:cx8="http://schemas.microsoft.com/office/drawing/2016/5/14/chartex" xmlns:mc="http://schemas.openxmlformats.org/markup-compatibility/2006" xmlns:aink="http://schemas.microsoft.com/office/drawing/2016/ink" xmlns:am3d="http://schemas.microsoft.com/office/drawing/2017/model3d" xmlns:o="urn:schemas-microsoft-com:office:office" xmlns:r="http://schemas.openxmlformats.org/officeDocument/2006/relationships" xmlns:m="http://schemas.openxmlformats.org/officeDocument/2006/math" xmlns:v="urn:schemas-microsoft-com:vml" xmlns:wp14="http://schemas.microsoft.com/office/word/2010/wordprocessingDrawing" xmlns:wp="http://schemas.openxmlformats.org/drawingml/2006/wordprocessingDrawing" xmlns:w10="urn:schemas-microsoft-com:office:word" xmlns:w="http://schemas.openxmlformats.org/wordprocessingml/2006/main" xmlns:w14="http://schemas.microsoft.com/office/word/2010/wordml" xmlns:w15="http://schemas.microsoft.com/office/word/2012/wordml" xmlns:w16cex="http://schemas.microsoft.com/office/word/2018/wordml/cex" xmlns:w16cid="http://schemas.microsoft.com/office/word/2016/wordml/cid" xmlns:w16="http://schemas.microsoft.com/office/word/2018/wordml" xmlns:w16sdtdh="http://schemas.microsoft.com/office/word/2020/wordml/sdtdatahash" xmlns:w16se="http://schemas.microsoft.com/office/word/2015/wordml/symex" xmlns:wpg="http://schemas.microsoft.com/office/word/2010/wordprocessingGroup" xmlns:wpi="http://schemas.microsoft.com/office/word/2010/wordprocessingInk" xmlns:wne="http://schemas.microsoft.com/office/word/2006/wordml" xmlns:wps="http://schemas.microsoft.com/office/word/2010/wordprocessingShape" mc:Ignorable="w14 w15 w16se w16cid w16 w16cex w16sdtdh wp14">
-  <w:docParts>
-    <w:docPart>
-      <w:docPartPr>
-        <w:name w:val="BC1A84D5C2E740B1A4E9102D7AFA3504"/>
-        <w:category>
-          <w:name w:val="General"/>
-          <w:gallery w:val="placeholder"/>
-        </w:category>
-        <w:types>
-          <w:type w:val="bbPlcHdr"/>
-        </w:types>
-        <w:behaviors>
-          <w:behavior w:val="content"/>
-        </w:behaviors>
-        <w:guid w:val="{0783F537-C4FD-4E2C-A1AA-ABC90B086313}"/>
-      </w:docPartPr>
-      <w:docPartBody>
-        <w:p>
-          <w:pPr>
-            <w:pStyle w:val="BC1A84D5C2E740B1A4E9102D7AFA3504"/>
-          </w:pPr>
-          <w:r>
-            <w:t>[Type here]</w:t>
-          </w:r>
-        </w:p>
-      </w:docPartBody>
-    </w:docPart>
-  </w:docParts>
-</w:glossaryDocument>
-</file>
-
-<file path=word/glossary/fontTable.xml><?xml version="1.0" encoding="utf-8"?>
-<w:fonts xmlns:mc="http://schemas.openxmlformats.org/markup-compatibility/2006" xmlns:r="http://schemas.openxmlformats.org/officeDocument/2006/relationships" xmlns:w="http://schemas.openxmlformats.org/wordprocessingml/2006/main" xmlns:w14="http://schemas.microsoft.com/office/word/2010/wordml" xmlns:w15="http://schemas.microsoft.com/office/word/2012/wordml" xmlns:w16cex="http://schemas.microsoft.com/office/word/2018/wordml/cex" xmlns:w16cid="http://schemas.microsoft.com/office/word/2016/wordml/cid" xmlns:w16="http://schemas.microsoft.com/office/word/2018/wordml" xmlns:w16sdtdh="http://schemas.microsoft.com/office/word/2020/wordml/sdtdatahash" xmlns:w16se="http://schemas.microsoft.com/office/word/2015/wordml/symex" mc:Ignorable="w14 w15 w16se w16cid w16 w16cex w16sdtdh">
-  <w:font w:name="Symbol">
-    <w:panose1 w:val="05050102010706020507"/>
-    <w:charset w:val="02"/>
-    <w:family w:val="roman"/>
-    <w:pitch w:val="variable"/>
-    <w:sig w:usb0="00000000" w:usb1="10000000" w:usb2="00000000" w:usb3="00000000" w:csb0="80000000" w:csb1="00000000"/>
-  </w:font>
-  <w:font w:name="Times New Roman">
-    <w:panose1 w:val="02020603050405020304"/>
-    <w:charset w:val="00"/>
-    <w:family w:val="roman"/>
-    <w:pitch w:val="variable"/>
-    <w:sig w:usb0="E0002EFF" w:usb1="C000785B" w:usb2="00000009" w:usb3="00000000" w:csb0="000001FF" w:csb1="00000000"/>
-  </w:font>
-  <w:font w:name="Wingdings">
-    <w:panose1 w:val="05000000000000000000"/>
-    <w:charset w:val="02"/>
-    <w:family w:val="auto"/>
-    <w:pitch w:val="variable"/>
-    <w:sig w:usb0="00000000" w:usb1="10000000" w:usb2="00000000" w:usb3="00000000" w:csb0="80000000" w:csb1="00000000"/>
-  </w:font>
-  <w:font w:name="Cambria">
-    <w:panose1 w:val="02040503050406030204"/>
-    <w:charset w:val="00"/>
-    <w:family w:val="roman"/>
-    <w:pitch w:val="variable"/>
-    <w:sig w:usb0="E00006FF" w:usb1="420024FF" w:usb2="02000000" w:usb3="00000000" w:csb0="0000019F" w:csb1="00000000"/>
-  </w:font>
-  <w:font w:name="Calibri">
-    <w:panose1 w:val="020F0502020204030204"/>
-    <w:charset w:val="00"/>
-    <w:family w:val="swiss"/>
-    <w:pitch w:val="variable"/>
-    <w:sig w:usb0="E4002EFF" w:usb1="C200247B" w:usb2="00000009" w:usb3="00000000" w:csb0="000001FF" w:csb1="00000000"/>
-  </w:font>
-  <w:font w:name="Consolas">
-    <w:panose1 w:val="020B0609020204030204"/>
-    <w:charset w:val="00"/>
-    <w:family w:val="modern"/>
-    <w:pitch w:val="fixed"/>
-    <w:sig w:usb0="E10006FF" w:usb1="4000FCFF" w:usb2="00000009" w:usb3="00000000" w:csb0="0000019F" w:csb1="00000000"/>
-  </w:font>
-  <w:font w:name="Calibri Light">
-    <w:panose1 w:val="020F0302020204030204"/>
-    <w:charset w:val="00"/>
-    <w:family w:val="swiss"/>
-    <w:pitch w:val="variable"/>
-    <w:sig w:usb0="E4002EFF" w:usb1="C200247B" w:usb2="00000009" w:usb3="00000000" w:csb0="000001FF" w:csb1="00000000"/>
-  </w:font>
-</w:fonts>
-</file>
-
-<file path=word/glossary/settings.xml><?xml version="1.0" encoding="utf-8"?>
-<w:settings xmlns:mc="http://schemas.openxmlformats.org/markup-compatibility/2006" xmlns:o="urn:schemas-microsoft-com:office:office" xmlns:r="http://schemas.openxmlformats.org/officeDocument/2006/relationships" xmlns:m="http://schemas.openxmlformats.org/officeDocument/2006/math" xmlns:v="urn:schemas-microsoft-com:vml" xmlns:w10="urn:schemas-microsoft-com:office:word" xmlns:w="http://schemas.openxmlformats.org/wordprocessingml/2006/main" xmlns:w14="http://schemas.microsoft.com/office/word/2010/wordml" xmlns:w15="http://schemas.microsoft.com/office/word/2012/wordml" xmlns:w16cex="http://schemas.microsoft.com/office/word/2018/wordml/cex" xmlns:w16cid="http://schemas.microsoft.com/office/word/2016/wordml/cid" xmlns:w16="http://schemas.microsoft.com/office/word/2018/wordml" xmlns:w16sdtdh="http://schemas.microsoft.com/office/word/2020/wordml/sdtdatahash" xmlns:w16se="http://schemas.microsoft.com/office/word/2015/wordml/symex" xmlns:sl="http://schemas.openxmlformats.org/schemaLibrary/2006/main" mc:Ignorable="w14 w15 w16se w16cid w16 w16cex w16sdtdh">
-  <w:view w:val="normal"/>
-  <w:defaultTabStop w:val="720"/>
-  <w:characterSpacingControl w:val="doNotCompress"/>
-  <w:compat>
-    <w:useFELayout/>
-    <w:compatSetting w:name="compatibilityMode" w:uri="http://schemas.microsoft.com/office/word" w:val="15"/>
-    <w:compatSetting w:name="overrideTableStyleFontSizeAndJustification" w:uri="http://schemas.microsoft.com/office/word" w:val="1"/>
-    <w:compatSetting w:name="enableOpenTypeFeatures" w:uri="http://schemas.microsoft.com/office/word" w:val="1"/>
-    <w:compatSetting w:name="doNotFlipMirrorIndents" w:uri="http://schemas.microsoft.com/office/word" w:val="1"/>
-    <w:compatSetting w:name="differentiateMultirowTableHeaders" w:uri="http://schemas.microsoft.com/office/word" w:val="1"/>
-    <w:compatSetting w:name="useWord2013TrackBottomHyphenation" w:uri="http://schemas.microsoft.com/office/word" w:val="0"/>
-  </w:compat>
-  <w:rsids>
-    <w:rsidRoot w:val="00A01595"/>
-    <w:rsid w:val="00375FC3"/>
-    <w:rsid w:val="00A01595"/>
-  </w:rsids>
-  <m:mathPr>
-    <m:mathFont m:val="Cambria Math"/>
-    <m:brkBin m:val="before"/>
-    <m:brkBinSub m:val="--"/>
-    <m:smallFrac m:val="0"/>
-    <m:dispDef/>
-    <m:lMargin m:val="0"/>
-    <m:rMargin m:val="0"/>
-    <m:defJc m:val="centerGroup"/>
-    <m:wrapIndent m:val="1440"/>
-    <m:intLim m:val="subSup"/>
-    <m:naryLim m:val="undOvr"/>
-  </m:mathPr>
-  <w:themeFontLang w:val="en-US"/>
-  <w:clrSchemeMapping w:bg1="light1" w:t1="dark1" w:bg2="light2" w:t2="dark2" w:accent1="accent1" w:accent2="accent2" w:accent3="accent3" w:accent4="accent4" w:accent5="accent5" w:accent6="accent6" w:hyperlink="hyperlink" w:followedHyperlink="followedHyperlink"/>
-  <w:decimalSymbol w:val="."/>
-  <w:listSeparator w:val=","/>
-  <w15:chartTrackingRefBased/>
-</w:settings>
-</file>
-
-<file path=word/glossary/styles.xml><?xml version="1.0" encoding="utf-8"?>
-<w:styles xmlns:mc="http://schemas.openxmlformats.org/markup-compatibility/2006" xmlns:r="http://schemas.openxmlformats.org/officeDocument/2006/relationships" xmlns:w="http://schemas.openxmlformats.org/wordprocessingml/2006/main" xmlns:w14="http://schemas.microsoft.com/office/word/2010/wordml" xmlns:w15="http://schemas.microsoft.com/office/word/2012/wordml" xmlns:w16cex="http://schemas.microsoft.com/office/word/2018/wordml/cex" xmlns:w16cid="http://schemas.microsoft.com/office/word/2016/wordml/cid" xmlns:w16="http://schemas.microsoft.com/office/word/2018/wordml" xmlns:w16sdtdh="http://schemas.microsoft.com/office/word/2020/wordml/sdtdatahash" xmlns:w16se="http://schemas.microsoft.com/office/word/2015/wordml/symex" mc:Ignorable="w14 w15 w16se w16cid w16 w16cex w16sdtdh">
-  <w:docDefaults>
-    <w:rPrDefault>
-      <w:rPr>
-        <w:rFonts w:asciiTheme="minorHAnsi" w:eastAsiaTheme="minorEastAsia" w:hAnsiTheme="minorHAnsi" w:cstheme="minorBidi"/>
-        <w:sz w:val="22"/>
-        <w:szCs w:val="22"/>
-        <w:lang w:val="en-US" w:eastAsia="en-US" w:bidi="ar-SA"/>
-      </w:rPr>
-    </w:rPrDefault>
-    <w:pPrDefault>
-      <w:pPr>
-        <w:spacing w:after="160" w:line="259" w:lineRule="auto"/>
-      </w:pPr>
-    </w:pPrDefault>
-  </w:docDefaults>
-  <w:latentStyles w:defLockedState="0" w:defUIPriority="99" w:defSemiHidden="0" w:defUnhideWhenUsed="0" w:defQFormat="0" w:count="376">
-    <w:lsdException w:name="Normal" w:uiPriority="0" w:qFormat="1"/>
-    <w:lsdException w:name="heading 1" w:uiPriority="9" w:qFormat="1"/>
-    <w:lsdException w:name="heading 2" w:semiHidden="1" w:uiPriority="9" w:unhideWhenUsed="1" w:qFormat="1"/>
-    <w:lsdException w:name="heading 3" w:semiHidden="1" w:uiPriority="9" w:unhideWhenUsed="1" w:qFormat="1"/>
-    <w:lsdException w:name="heading 4" w:semiHidden="1" w:uiPriority="9" w:unhideWhenUsed="1" w:qFormat="1"/>
-    <w:lsdException w:name="heading 5" w:semiHidden="1" w:uiPriority="9" w:unhideWhenUsed="1" w:qFormat="1"/>
-    <w:lsdException w:name="heading 6" w:semiHidden="1" w:uiPriority="9" w:unhideWhenUsed="1" w:qFormat="1"/>
-    <w:lsdException w:name="heading 7" w:semiHidden="1" w:uiPriority="9" w:unhideWhenUsed="1" w:qFormat="1"/>
-    <w:lsdException w:name="heading 8" w:semiHidden="1" w:uiPriority="9" w:unhideWhenUsed="1" w:qFormat="1"/>
-    <w:lsdException w:name="heading 9" w:semiHidden="1" w:uiPriority="9" w:unhideWhenUsed="1" w:qFormat="1"/>
-    <w:lsdException w:name="index 1" w:semiHidden="1" w:unhideWhenUsed="1"/>
-    <w:lsdException w:name="index 2" w:semiHidden="1" w:unhideWhenUsed="1"/>
-    <w:lsdException w:name="index 3" w:semiHidden="1" w:unhideWhenUsed="1"/>
-    <w:lsdException w:name="index 4" w:semiHidden="1" w:unhideWhenUsed="1"/>
-    <w:lsdException w:name="index 5" w:semiHidden="1" w:unhideWhenUsed="1"/>
-    <w:lsdException w:name="index 6" w:semiHidden="1" w:unhideWhenUsed="1"/>
-    <w:lsdException w:name="index 7" w:semiHidden="1" w:unhideWhenUsed="1"/>
-    <w:lsdException w:name="index 8" w:semiHidden="1" w:unhideWhenUsed="1"/>
-    <w:lsdException w:name="index 9" w:semiHidden="1" w:unhideWhenUsed="1"/>
-    <w:lsdException w:name="toc 1" w:semiHidden="1" w:uiPriority="39" w:unhideWhenUsed="1"/>
-    <w:lsdException w:name="toc 2" w:semiHidden="1" w:uiPriority="39" w:unhideWhenUsed="1"/>
-    <w:lsdException w:name="toc 3" w:semiHidden="1" w:uiPriority="39" w:unhideWhenUsed="1"/>
-    <w:lsdException w:name="toc 4" w:semiHidden="1" w:uiPriority="39" w:unhideWhenUsed="1"/>
-    <w:lsdException w:name="toc 5" w:semiHidden="1" w:uiPriority="39" w:unhideWhenUsed="1"/>
-    <w:lsdException w:name="toc 6" w:semiHidden="1" w:uiPriority="39" w:unhideWhenUsed="1"/>
-    <w:lsdException w:name="toc 7" w:semiHidden="1" w:uiPriority="39" w:unhideWhenUsed="1"/>
-    <w:lsdException w:name="toc 8" w:semiHidden="1" w:uiPriority="39" w:unhideWhenUsed="1"/>
-    <w:lsdException w:name="toc 9" w:semiHidden="1" w:uiPriority="39" w:unhideWhenUsed="1"/>
-    <w:lsdException w:name="Normal Indent" w:semiHidden="1" w:unhideWhenUsed="1"/>
-    <w:lsdException w:name="footnote text" w:semiHidden="1" w:unhideWhenUsed="1"/>
-    <w:lsdException w:name="annotation text" w:semiHidden="1" w:unhideWhenUsed="1"/>
-    <w:lsdException w:name="header" w:semiHidden="1" w:unhideWhenUsed="1"/>
-    <w:lsdException w:name="footer" w:semiHidden="1" w:unhideWhenUsed="1"/>
-    <w:lsdException w:name="index heading" w:semiHidden="1" w:unhideWhenUsed="1"/>
-    <w:lsdException w:name="caption" w:semiHidden="1" w:uiPriority="35" w:unhideWhenUsed="1" w:qFormat="1"/>
-    <w:lsdException w:name="table of figures" w:semiHidden="1" w:unhideWhenUsed="1"/>
-    <w:lsdException w:name="envelope address" w:semiHidden="1" w:unhideWhenUsed="1"/>
-    <w:lsdException w:name="envelope return" w:semiHidden="1" w:unhideWhenUsed="1"/>
-    <w:lsdException w:name="footnote reference" w:semiHidden="1" w:unhideWhenUsed="1"/>
-    <w:lsdException w:name="annotation reference" w:semiHidden="1" w:unhideWhenUsed="1"/>
-    <w:lsdException w:name="line number" w:semiHidden="1" w:unhideWhenUsed="1"/>
-    <w:lsdException w:name="page number" w:semiHidden="1" w:unhideWhenUsed="1"/>
-    <w:lsdException w:name="endnote reference" w:semiHidden="1" w:unhideWhenUsed="1"/>
-    <w:lsdException w:name="endnote text" w:semiHidden="1" w:unhideWhenUsed="1"/>
-    <w:lsdException w:name="table of authorities" w:semiHidden="1" w:unhideWhenUsed="1"/>
-    <w:lsdException w:name="macro" w:semiHidden="1" w:unhideWhenUsed="1"/>
-    <w:lsdException w:name="toa heading" w:semiHidden="1" w:unhideWhenUsed="1"/>
-    <w:lsdException w:name="List" w:semiHidden="1" w:unhideWhenUsed="1"/>
-    <w:lsdException w:name="List Bullet" w:semiHidden="1" w:unhideWhenUsed="1"/>
-    <w:lsdException w:name="List Number" w:semiHidden="1" w:unhideWhenUsed="1"/>
-    <w:lsdException w:name="List 2" w:semiHidden="1" w:unhideWhenUsed="1"/>
-    <w:lsdException w:name="List 3" w:semiHidden="1" w:unhideWhenUsed="1"/>
-    <w:lsdException w:name="List 4" w:semiHidden="1" w:unhideWhenUsed="1"/>
-    <w:lsdException w:name="List 5" w:semiHidden="1" w:unhideWhenUsed="1"/>
-    <w:lsdException w:name="List Bullet 2" w:semiHidden="1" w:unhideWhenUsed="1"/>
-    <w:lsdException w:name="List Bullet 3" w:semiHidden="1" w:unhideWhenUsed="1"/>
-    <w:lsdException w:name="List Bullet 4" w:semiHidden="1" w:unhideWhenUsed="1"/>
-    <w:lsdException w:name="List Bullet 5" w:semiHidden="1" w:unhideWhenUsed="1"/>
-    <w:lsdException w:name="List Number 2" w:semiHidden="1" w:unhideWhenUsed="1"/>
-    <w:lsdException w:name="List Number 3" w:semiHidden="1" w:unhideWhenUsed="1"/>
-    <w:lsdException w:name="List Number 4" w:semiHidden="1" w:unhideWhenUsed="1"/>
-    <w:lsdException w:name="List Number 5" w:semiHidden="1" w:unhideWhenUsed="1"/>
-    <w:lsdException w:name="Title" w:uiPriority="10" w:qFormat="1"/>
-    <w:lsdException w:name="Closing" w:semiHidden="1" w:unhideWhenUsed="1"/>
-    <w:lsdException w:name="Signature" w:semiHidden="1" w:unhideWhenUsed="1"/>
-    <w:lsdException w:name="Default Paragraph Font" w:semiHidden="1" w:uiPriority="1" w:unhideWhenUsed="1"/>
-    <w:lsdException w:name="Body Text" w:semiHidden="1" w:unhideWhenUsed="1"/>
-    <w:lsdException w:name="Body Text Indent" w:semiHidden="1" w:unhideWhenUsed="1"/>
-    <w:lsdException w:name="List Continue" w:semiHidden="1" w:unhideWhenUsed="1"/>
-    <w:lsdException w:name="List Continue 2" w:semiHidden="1" w:unhideWhenUsed="1"/>
-    <w:lsdException w:name="List Continue 3" w:semiHidden="1" w:unhideWhenUsed="1"/>
-    <w:lsdException w:name="List Continue 4" w:semiHidden="1" w:unhideWhenUsed="1"/>
-    <w:lsdException w:name="List Continue 5" w:semiHidden="1" w:unhideWhenUsed="1"/>
-    <w:lsdException w:name="Message Header" w:semiHidden="1" w:unhideWhenUsed="1"/>
-    <w:lsdException w:name="Subtitle" w:uiPriority="11" w:qFormat="1"/>
-    <w:lsdException w:name="Salutation" w:semiHidden="1" w:unhideWhenUsed="1"/>
-    <w:lsdException w:name="Date" w:semiHidden="1" w:unhideWhenUsed="1"/>
-    <w:lsdException w:name="Body Text First Indent" w:semiHidden="1" w:unhideWhenUsed="1"/>
-    <w:lsdException w:name="Body Text First Indent 2" w:semiHidden="1" w:unhideWhenUsed="1"/>
-    <w:lsdException w:name="Note Heading" w:semiHidden="1" w:unhideWhenUsed="1"/>
-    <w:lsdException w:name="Body Text 2" w:semiHidden="1" w:unhideWhenUsed="1"/>
-    <w:lsdException w:name="Body Text 3" w:semiHidden="1" w:unhideWhenUsed="1"/>
-    <w:lsdException w:name="Body Text Indent 2" w:semiHidden="1" w:unhideWhenUsed="1"/>
-    <w:lsdException w:name="Body Text Indent 3" w:semiHidden="1" w:unhideWhenUsed="1"/>
-    <w:lsdException w:name="Block Text" w:semiHidden="1" w:unhideWhenUsed="1"/>
-    <w:lsdException w:name="Hyperlink" w:semiHidden="1" w:unhideWhenUsed="1"/>
-    <w:lsdException w:name="FollowedHyperlink" w:semiHidden="1" w:unhideWhenUsed="1"/>
-    <w:lsdException w:name="Strong" w:uiPriority="22" w:qFormat="1"/>
-    <w:lsdException w:name="Emphasis" w:uiPriority="20" w:qFormat="1"/>
-    <w:lsdException w:name="Document Map" w:semiHidden="1" w:unhideWhenUsed="1"/>
-    <w:lsdException w:name="Plain Text" w:semiHidden="1" w:unhideWhenUsed="1"/>
-    <w:lsdException w:name="E-mail Signature" w:semiHidden="1" w:unhideWhenUsed="1"/>
-    <w:lsdException w:name="HTML Top of Form" w:semiHidden="1" w:unhideWhenUsed="1"/>
-    <w:lsdException w:name="HTML Bottom of Form" w:semiHidden="1" w:unhideWhenUsed="1"/>
-    <w:lsdException w:name="Normal (Web)" w:semiHidden="1" w:unhideWhenUsed="1"/>
-    <w:lsdException w:name="HTML Acronym" w:semiHidden="1" w:unhideWhenUsed="1"/>
-    <w:lsdException w:name="HTML Address" w:semiHidden="1" w:unhideWhenUsed="1"/>
-    <w:lsdException w:name="HTML Cite" w:semiHidden="1" w:unhideWhenUsed="1"/>
-    <w:lsdException w:name="HTML Code" w:semiHidden="1" w:unhideWhenUsed="1"/>
-    <w:lsdException w:name="HTML Definition" w:semiHidden="1" w:unhideWhenUsed="1"/>
-    <w:lsdException w:name="HTML Keyboard" w:semiHidden="1" w:unhideWhenUsed="1"/>
-    <w:lsdException w:name="HTML Preformatted" w:semiHidden="1" w:unhideWhenUsed="1"/>
-    <w:lsdException w:name="HTML Sample" w:semiHidden="1" w:unhideWhenUsed="1"/>
-    <w:lsdException w:name="HTML Typewriter" w:semiHidden="1" w:unhideWhenUsed="1"/>
-    <w:lsdException w:name="HTML Variable" w:semiHidden="1" w:unhideWhenUsed="1"/>
-    <w:lsdException w:name="Normal Table" w:semiHidden="1" w:unhideWhenUsed="1"/>
-    <w:lsdException w:name="annotation subject" w:semiHidden="1" w:unhideWhenUsed="1"/>
-    <w:lsdException w:name="No List" w:semiHidden="1" w:unhideWhenUsed="1"/>
-    <w:lsdException w:name="Outline List 1" w:semiHidden="1" w:unhideWhenUsed="1"/>
-    <w:lsdException w:name="Outline List 2" w:semiHidden="1" w:unhideWhenUsed="1"/>
-    <w:lsdException w:name="Outline List 3" w:semiHidden="1" w:unhideWhenUsed="1"/>
-    <w:lsdException w:name="Table Simple 1" w:semiHidden="1" w:unhideWhenUsed="1"/>
-    <w:lsdException w:name="Table Simple 2" w:semiHidden="1" w:unhideWhenUsed="1"/>
-    <w:lsdException w:name="Table Simple 3" w:semiHidden="1" w:unhideWhenUsed="1"/>
-    <w:lsdException w:name="Table Classic 1" w:semiHidden="1" w:unhideWhenUsed="1"/>
-    <w:lsdException w:name="Table Classic 2" w:semiHidden="1" w:unhideWhenUsed="1"/>
-    <w:lsdException w:name="Table Classic 3" w:semiHidden="1" w:unhideWhenUsed="1"/>
-    <w:lsdException w:name="Table Classic 4" w:semiHidden="1" w:unhideWhenUsed="1"/>
-    <w:lsdException w:name="Table Colorful 1" w:semiHidden="1" w:unhideWhenUsed="1"/>
-    <w:lsdException w:name="Table Colorful 2" w:semiHidden="1" w:unhideWhenUsed="1"/>
-    <w:lsdException w:name="Table Colorful 3" w:semiHidden="1" w:unhideWhenUsed="1"/>
-    <w:lsdException w:name="Table Columns 1" w:semiHidden="1" w:unhideWhenUsed="1"/>
-    <w:lsdException w:name="Table Columns 2" w:semiHidden="1" w:unhideWhenUsed="1"/>
-    <w:lsdException w:name="Table Columns 3" w:semiHidden="1" w:unhideWhenUsed="1"/>
-    <w:lsdException w:name="Table Columns 4" w:semiHidden="1" w:unhideWhenUsed="1"/>
-    <w:lsdException w:name="Table Columns 5" w:semiHidden="1" w:unhideWhenUsed="1"/>
-    <w:lsdException w:name="Table Grid 1" w:semiHidden="1" w:unhideWhenUsed="1"/>
-    <w:lsdException w:name="Table Grid 2" w:semiHidden="1" w:unhideWhenUsed="1"/>
-    <w:lsdException w:name="Table Grid 3" w:semiHidden="1" w:unhideWhenUsed="1"/>
-    <w:lsdException w:name="Table Grid 4" w:semiHidden="1" w:unhideWhenUsed="1"/>
-    <w:lsdException w:name="Table Grid 5" w:semiHidden="1" w:unhideWhenUsed="1"/>
-    <w:lsdException w:name="Table Grid 6" w:semiHidden="1" w:unhideWhenUsed="1"/>
-    <w:lsdException w:name="Table Grid 7" w:semiHidden="1" w:unhideWhenUsed="1"/>
-    <w:lsdException w:name="Table Grid 8" w:semiHidden="1" w:unhideWhenUsed="1"/>
-    <w:lsdException w:name="Table List 1" w:semiHidden="1" w:unhideWhenUsed="1"/>
-    <w:lsdException w:name="Table List 2" w:semiHidden="1" w:unhideWhenUsed="1"/>
-    <w:lsdException w:name="Table List 3" w:semiHidden="1" w:unhideWhenUsed="1"/>
-    <w:lsdException w:name="Table List 4" w:semiHidden="1" w:unhideWhenUsed="1"/>
-    <w:lsdException w:name="Table List 5" w:semiHidden="1" w:unhideWhenUsed="1"/>
-    <w:lsdException w:name="Table List 6" w:semiHidden="1" w:unhideWhenUsed="1"/>
-    <w:lsdException w:name="Table List 7" w:semiHidden="1" w:unhideWhenUsed="1"/>
-    <w:lsdException w:name="Table List 8" w:semiHidden="1" w:unhideWhenUsed="1"/>
-    <w:lsdException w:name="Table 3D effects 1" w:semiHidden="1" w:unhideWhenUsed="1"/>
-    <w:lsdException w:name="Table 3D effects 2" w:semiHidden="1" w:unhideWhenUsed="1"/>
-    <w:lsdException w:name="Table 3D effects 3" w:semiHidden="1" w:unhideWhenUsed="1"/>
-    <w:lsdException w:name="Table Contemporary" w:semiHidden="1" w:unhideWhenUsed="1"/>
-    <w:lsdException w:name="Table Elegant" w:semiHidden="1" w:unhideWhenUsed="1"/>
-    <w:lsdException w:name="Table Professional" w:semiHidden="1" w:unhideWhenUsed="1"/>
-    <w:lsdException w:name="Table Subtle 1" w:semiHidden="1" w:unhideWhenUsed="1"/>
-    <w:lsdException w:name="Table Subtle 2" w:semiHidden="1" w:unhideWhenUsed="1"/>
-    <w:lsdException w:name="Table Web 1" w:semiHidden="1" w:unhideWhenUsed="1"/>
-    <w:lsdException w:name="Table Web 2" w:semiHidden="1" w:unhideWhenUsed="1"/>
-    <w:lsdException w:name="Table Web 3" w:semiHidden="1" w:unhideWhenUsed="1"/>
-    <w:lsdException w:name="Balloon Text" w:semiHidden="1" w:unhideWhenUsed="1"/>
-    <w:lsdException w:name="Table Grid" w:uiPriority="39"/>
-    <w:lsdException w:name="Table Theme" w:semiHidden="1" w:unhideWhenUsed="1"/>
-    <w:lsdException w:name="Placeholder Text" w:semiHidden="1"/>
-    <w:lsdException w:name="No Spacing" w:uiPriority="1" w:qFormat="1"/>
-    <w:lsdException w:name="Light Shading" w:uiPriority="60"/>
-    <w:lsdException w:name="Light List" w:uiPriority="61"/>
-    <w:lsdException w:name="Light Grid" w:uiPriority="62"/>
-    <w:lsdException w:name="Medium Shading 1" w:uiPriority="63"/>
-    <w:lsdException w:name="Medium Shading 2" w:uiPriority="64"/>
-    <w:lsdException w:name="Medium List 1" w:uiPriority="65"/>
-    <w:lsdException w:name="Medium List 2" w:uiPriority="66"/>
-    <w:lsdException w:name="Medium Grid 1" w:uiPriority="67"/>
-    <w:lsdException w:name="Medium Grid 2" w:uiPriority="68"/>
-    <w:lsdException w:name="Medium Grid 3" w:uiPriority="69"/>
-    <w:lsdException w:name="Dark List" w:uiPriority="70"/>
-    <w:lsdException w:name="Colorful Shading" w:uiPriority="71"/>
-    <w:lsdException w:name="Colorful List" w:uiPriority="72"/>
-    <w:lsdException w:name="Colorful Grid" w:uiPriority="73"/>
-    <w:lsdException w:name="Light Shading Accent 1" w:uiPriority="60"/>
-    <w:lsdException w:name="Light List Accent 1" w:uiPriority="61"/>
-    <w:lsdException w:name="Light Grid Accent 1" w:uiPriority="62"/>
-    <w:lsdException w:name="Medium Shading 1 Accent 1" w:uiPriority="63"/>
-    <w:lsdException w:name="Medium Shading 2 Accent 1" w:uiPriority="64"/>
-    <w:lsdException w:name="Medium List 1 Accent 1" w:uiPriority="65"/>
-    <w:lsdException w:name="Revision" w:semiHidden="1"/>
-    <w:lsdException w:name="List Paragraph" w:uiPriority="34" w:qFormat="1"/>
-    <w:lsdException w:name="Quote" w:uiPriority="29" w:qFormat="1"/>
-    <w:lsdException w:name="Intense Quote" w:uiPriority="30" w:qFormat="1"/>
-    <w:lsdException w:name="Medium List 2 Accent 1" w:uiPriority="66"/>
-    <w:lsdException w:name="Medium Grid 1 Accent 1" w:uiPriority="67"/>
-    <w:lsdException w:name="Medium Grid 2 Accent 1" w:uiPriority="68"/>
-    <w:lsdException w:name="Medium Grid 3 Accent 1" w:uiPriority="69"/>
-    <w:lsdException w:name="Dark List Accent 1" w:uiPriority="70"/>
-    <w:lsdException w:name="Colorful Shading Accent 1" w:uiPriority="71"/>
-    <w:lsdException w:name="Colorful List Accent 1" w:uiPriority="72"/>
-    <w:lsdException w:name="Colorful Grid Accent 1" w:uiPriority="73"/>
-    <w:lsdException w:name="Light Shading Accent 2" w:uiPriority="60"/>
-    <w:lsdException w:name="Light List Accent 2" w:uiPriority="61"/>
-    <w:lsdException w:name="Light Grid Accent 2" w:uiPriority="62"/>
-    <w:lsdException w:name="Medium Shading 1 Accent 2" w:uiPriority="63"/>
-    <w:lsdException w:name="Medium Shading 2 Accent 2" w:uiPriority="64"/>
-    <w:lsdException w:name="Medium List 1 Accent 2" w:uiPriority="65"/>
-    <w:lsdException w:name="Medium List 2 Accent 2" w:uiPriority="66"/>
-    <w:lsdException w:name="Medium Grid 1 Accent 2" w:uiPriority="67"/>
-    <w:lsdException w:name="Medium Grid 2 Accent 2" w:uiPriority="68"/>
-    <w:lsdException w:name="Medium Grid 3 Accent 2" w:uiPriority="69"/>
-    <w:lsdException w:name="Dark List Accent 2" w:uiPriority="70"/>
-    <w:lsdException w:name="Colorful Shading Accent 2" w:uiPriority="71"/>
-    <w:lsdException w:name="Colorful List Accent 2" w:uiPriority="72"/>
-    <w:lsdException w:name="Colorful Grid Accent 2" w:uiPriority="73"/>
-    <w:lsdException w:name="Light Shading Accent 3" w:uiPriority="60"/>
-    <w:lsdException w:name="Light List Accent 3" w:uiPriority="61"/>
-    <w:lsdException w:name="Light Grid Accent 3" w:uiPriority="62"/>
-    <w:lsdException w:name="Medium Shading 1 Accent 3" w:uiPriority="63"/>
-    <w:lsdException w:name="Medium Shading 2 Accent 3" w:uiPriority="64"/>
-    <w:lsdException w:name="Medium List 1 Accent 3" w:uiPriority="65"/>
-    <w:lsdException w:name="Medium List 2 Accent 3" w:uiPriority="66"/>
-    <w:lsdException w:name="Medium Grid 1 Accent 3" w:uiPriority="67"/>
-    <w:lsdException w:name="Medium Grid 2 Accent 3" w:uiPriority="68"/>
-    <w:lsdException w:name="Medium Grid 3 Accent 3" w:uiPriority="69"/>
-    <w:lsdException w:name="Dark List Accent 3" w:uiPriority="70"/>
-    <w:lsdException w:name="Colorful Shading Accent 3" w:uiPriority="71"/>
-    <w:lsdException w:name="Colorful List Accent 3" w:uiPriority="72"/>
-    <w:lsdException w:name="Colorful Grid Accent 3" w:uiPriority="73"/>
-    <w:lsdException w:name="Light Shading Accent 4" w:uiPriority="60"/>
-    <w:lsdException w:name="Light List Accent 4" w:uiPriority="61"/>
-    <w:lsdException w:name="Light Grid Accent 4" w:uiPriority="62"/>
-    <w:lsdException w:name="Medium Shading 1 Accent 4" w:uiPriority="63"/>
-    <w:lsdException w:name="Medium Shading 2 Accent 4" w:uiPriority="64"/>
-    <w:lsdException w:name="Medium List 1 Accent 4" w:uiPriority="65"/>
-    <w:lsdException w:name="Medium List 2 Accent 4" w:uiPriority="66"/>
-    <w:lsdException w:name="Medium Grid 1 Accent 4" w:uiPriority="67"/>
-    <w:lsdException w:name="Medium Grid 2 Accent 4" w:uiPriority="68"/>
-    <w:lsdException w:name="Medium Grid 3 Accent 4" w:uiPriority="69"/>
-    <w:lsdException w:name="Dark List Accent 4" w:uiPriority="70"/>
-    <w:lsdException w:name="Colorful Shading Accent 4" w:uiPriority="71"/>
-    <w:lsdException w:name="Colorful List Accent 4" w:uiPriority="72"/>
-    <w:lsdException w:name="Colorful Grid Accent 4" w:uiPriority="73"/>
-    <w:lsdException w:name="Light Shading Accent 5" w:uiPriority="60"/>
-    <w:lsdException w:name="Light List Accent 5" w:uiPriority="61"/>
-    <w:lsdException w:name="Light Grid Accent 5" w:uiPriority="62"/>
-    <w:lsdException w:name="Medium Shading 1 Accent 5" w:uiPriority="63"/>
-    <w:lsdException w:name="Medium Shading 2 Accent 5" w:uiPriority="64"/>
-    <w:lsdException w:name="Medium List 1 Accent 5" w:uiPriority="65"/>
-    <w:lsdException w:name="Medium List 2 Accent 5" w:uiPriority="66"/>
-    <w:lsdException w:name="Medium Grid 1 Accent 5" w:uiPriority="67"/>
-    <w:lsdException w:name="Medium Grid 2 Accent 5" w:uiPriority="68"/>
-    <w:lsdException w:name="Medium Grid 3 Accent 5" w:uiPriority="69"/>
-    <w:lsdException w:name="Dark List Accent 5" w:uiPriority="70"/>
-    <w:lsdException w:name="Colorful Shading Accent 5" w:uiPriority="71"/>
-    <w:lsdException w:name="Colorful List Accent 5" w:uiPriority="72"/>
-    <w:lsdException w:name="Colorful Grid Accent 5" w:uiPriority="73"/>
-    <w:lsdException w:name="Light Shading Accent 6" w:uiPriority="60"/>
-    <w:lsdException w:name="Light List Accent 6" w:uiPriority="61"/>
-    <w:lsdException w:name="Light Grid Accent 6" w:uiPriority="62"/>
-    <w:lsdException w:name="Medium Shading 1 Accent 6" w:uiPriority="63"/>
-    <w:lsdException w:name="Medium Shading 2 Accent 6" w:uiPriority="64"/>
-    <w:lsdException w:name="Medium List 1 Accent 6" w:uiPriority="65"/>
-    <w:lsdException w:name="Medium List 2 Accent 6" w:uiPriority="66"/>
-    <w:lsdException w:name="Medium Grid 1 Accent 6" w:uiPriority="67"/>
-    <w:lsdException w:name="Medium Grid 2 Accent 6" w:uiPriority="68"/>
-    <w:lsdException w:name="Medium Grid 3 Accent 6" w:uiPriority="69"/>
-    <w:lsdException w:name="Dark List Accent 6" w:uiPriority="70"/>
-    <w:lsdException w:name="Colorful Shading Accent 6" w:uiPriority="71"/>
-    <w:lsdException w:name="Colorful List Accent 6" w:uiPriority="72"/>
-    <w:lsdException w:name="Colorful Grid Accent 6" w:uiPriority="73"/>
-    <w:lsdException w:name="Subtle Emphasis" w:uiPriority="19" w:qFormat="1"/>
-    <w:lsdException w:name="Intense Emphasis" w:uiPriority="21" w:qFormat="1"/>
-    <w:lsdException w:name="Subtle Reference" w:uiPriority="31" w:qFormat="1"/>
-    <w:lsdException w:name="Intense Reference" w:uiPriority="32" w:qFormat="1"/>
-    <w:lsdException w:name="Book Title" w:uiPriority="33" w:qFormat="1"/>
-    <w:lsdException w:name="Bibliography" w:semiHidden="1" w:uiPriority="37" w:unhideWhenUsed="1"/>
-    <w:lsdException w:name="TOC Heading" w:semiHidden="1" w:uiPriority="39" w:unhideWhenUsed="1" w:qFormat="1"/>
-    <w:lsdException w:name="Plain Table 1" w:uiPriority="41"/>
-    <w:lsdException w:name="Plain Table 2" w:uiPriority="42"/>
-    <w:lsdException w:name="Plain Table 3" w:uiPriority="43"/>
-    <w:lsdException w:name="Plain Table 4" w:uiPriority="44"/>
-    <w:lsdException w:name="Plain Table 5" w:uiPriority="45"/>
-    <w:lsdException w:name="Grid Table Light" w:uiPriority="40"/>
-    <w:lsdException w:name="Grid Table 1 Light" w:uiPriority="46"/>
-    <w:lsdException w:name="Grid Table 2" w:uiPriority="47"/>
-    <w:lsdException w:name="Grid Table 3" w:uiPriority="48"/>
-    <w:lsdException w:name="Grid Table 4" w:uiPriority="49"/>
-    <w:lsdException w:name="Grid Table 5 Dark" w:uiPriority="50"/>
-    <w:lsdException w:name="Grid Table 6 Colorful" w:uiPriority="51"/>
-    <w:lsdException w:name="Grid Table 7 Colorful" w:uiPriority="52"/>
-    <w:lsdException w:name="Grid Table 1 Light Accent 1" w:uiPriority="46"/>
-    <w:lsdException w:name="Grid Table 2 Accent 1" w:uiPriority="47"/>
-    <w:lsdException w:name="Grid Table 3 Accent 1" w:uiPriority="48"/>
-    <w:lsdException w:name="Grid Table 4 Accent 1" w:uiPriority="49"/>
-    <w:lsdException w:name="Grid Table 5 Dark Accent 1" w:uiPriority="50"/>
-    <w:lsdException w:name="Grid Table 6 Colorful Accent 1" w:uiPriority="51"/>
-    <w:lsdException w:name="Grid Table 7 Colorful Accent 1" w:uiPriority="52"/>
-    <w:lsdException w:name="Grid Table 1 Light Accent 2" w:uiPriority="46"/>
-    <w:lsdException w:name="Grid Table 2 Accent 2" w:uiPriority="47"/>
-    <w:lsdException w:name="Grid Table 3 Accent 2" w:uiPriority="48"/>
-    <w:lsdException w:name="Grid Table 4 Accent 2" w:uiPriority="49"/>
-    <w:lsdException w:name="Grid Table 5 Dark Accent 2" w:uiPriority="50"/>
-    <w:lsdException w:name="Grid Table 6 Colorful Accent 2" w:uiPriority="51"/>
-    <w:lsdException w:name="Grid Table 7 Colorful Accent 2" w:uiPriority="52"/>
-    <w:lsdException w:name="Grid Table 1 Light Accent 3" w:uiPriority="46"/>
-    <w:lsdException w:name="Grid Table 2 Accent 3" w:uiPriority="47"/>
-    <w:lsdException w:name="Grid Table 3 Accent 3" w:uiPriority="48"/>
-    <w:lsdException w:name="Grid Table 4 Accent 3" w:uiPriority="49"/>
-    <w:lsdException w:name="Grid Table 5 Dark Accent 3" w:uiPriority="50"/>
-    <w:lsdException w:name="Grid Table 6 Colorful Accent 3" w:uiPriority="51"/>
-    <w:lsdException w:name="Grid Table 7 Colorful Accent 3" w:uiPriority="52"/>
-    <w:lsdException w:name="Grid Table 1 Light Accent 4" w:uiPriority="46"/>
-    <w:lsdException w:name="Grid Table 2 Accent 4" w:uiPriority="47"/>
-    <w:lsdException w:name="Grid Table 3 Accent 4" w:uiPriority="48"/>
-    <w:lsdException w:name="Grid Table 4 Accent 4" w:uiPriority="49"/>
-    <w:lsdException w:name="Grid Table 5 Dark Accent 4" w:uiPriority="50"/>
-    <w:lsdException w:name="Grid Table 6 Colorful Accent 4" w:uiPriority="51"/>
-    <w:lsdException w:name="Grid Table 7 Colorful Accent 4" w:uiPriority="52"/>
-    <w:lsdException w:name="Grid Table 1 Light Accent 5" w:uiPriority="46"/>
-    <w:lsdException w:name="Grid Table 2 Accent 5" w:uiPriority="47"/>
-    <w:lsdException w:name="Grid Table 3 Accent 5" w:uiPriority="48"/>
-    <w:lsdException w:name="Grid Table 4 Accent 5" w:uiPriority="49"/>
-    <w:lsdException w:name="Grid Table 5 Dark Accent 5" w:uiPriority="50"/>
-    <w:lsdException w:name="Grid Table 6 Colorful Accent 5" w:uiPriority="51"/>
-    <w:lsdException w:name="Grid Table 7 Colorful Accent 5" w:uiPriority="52"/>
-    <w:lsdException w:name="Grid Table 1 Light Accent 6" w:uiPriority="46"/>
-    <w:lsdException w:name="Grid Table 2 Accent 6" w:uiPriority="47"/>
-    <w:lsdException w:name="Grid Table 3 Accent 6" w:uiPriority="48"/>
-    <w:lsdException w:name="Grid Table 4 Accent 6" w:uiPriority="49"/>
-    <w:lsdException w:name="Grid Table 5 Dark Accent 6" w:uiPriority="50"/>
-    <w:lsdException w:name="Grid Table 6 Colorful Accent 6" w:uiPriority="51"/>
-    <w:lsdException w:name="Grid Table 7 Colorful Accent 6" w:uiPriority="52"/>
-    <w:lsdException w:name="List Table 1 Light" w:uiPriority="46"/>
-    <w:lsdException w:name="List Table 2" w:uiPriority="47"/>
-    <w:lsdException w:name="List Table 3" w:uiPriority="48"/>
-    <w:lsdException w:name="List Table 4" w:uiPriority="49"/>
-    <w:lsdException w:name="List Table 5 Dark" w:uiPriority="50"/>
-    <w:lsdException w:name="List Table 6 Colorful" w:uiPriority="51"/>
-    <w:lsdException w:name="List Table 7 Colorful" w:uiPriority="52"/>
-    <w:lsdException w:name="List Table 1 Light Accent 1" w:uiPriority="46"/>
-    <w:lsdException w:name="List Table 2 Accent 1" w:uiPriority="47"/>
-    <w:lsdException w:name="List Table 3 Accent 1" w:uiPriority="48"/>
-    <w:lsdException w:name="List Table 4 Accent 1" w:uiPriority="49"/>
-    <w:lsdException w:name="List Table 5 Dark Accent 1" w:uiPriority="50"/>
-    <w:lsdException w:name="List Table 6 Colorful Accent 1" w:uiPriority="51"/>
-    <w:lsdException w:name="List Table 7 Colorful Accent 1" w:uiPriority="52"/>
-    <w:lsdException w:name="List Table 1 Light Accent 2" w:uiPriority="46"/>
-    <w:lsdException w:name="List Table 2 Accent 2" w:uiPriority="47"/>
-    <w:lsdException w:name="List Table 3 Accent 2" w:uiPriority="48"/>
-    <w:lsdException w:name="List Table 4 Accent 2" w:uiPriority="49"/>
-    <w:lsdException w:name="List Table 5 Dark Accent 2" w:uiPriority="50"/>
-    <w:lsdException w:name="List Table 6 Colorful Accent 2" w:uiPriority="51"/>
-    <w:lsdException w:name="List Table 7 Colorful Accent 2" w:uiPriority="52"/>
-    <w:lsdException w:name="List Table 1 Light Accent 3" w:uiPriority="46"/>
-    <w:lsdException w:name="List Table 2 Accent 3" w:uiPriority="47"/>
-    <w:lsdException w:name="List Table 3 Accent 3" w:uiPriority="48"/>
-    <w:lsdException w:name="List Table 4 Accent 3" w:uiPriority="49"/>
-    <w:lsdException w:name="List Table 5 Dark Accent 3" w:uiPriority="50"/>
-    <w:lsdException w:name="List Table 6 Colorful Accent 3" w:uiPriority="51"/>
-    <w:lsdException w:name="List Table 7 Colorful Accent 3" w:uiPriority="52"/>
-    <w:lsdException w:name="List Table 1 Light Accent 4" w:uiPriority="46"/>
-    <w:lsdException w:name="List Table 2 Accent 4" w:uiPriority="47"/>
-    <w:lsdException w:name="List Table 3 Accent 4" w:uiPriority="48"/>
-    <w:lsdException w:name="List Table 4 Accent 4" w:uiPriority="49"/>
-    <w:lsdException w:name="List Table 5 Dark Accent 4" w:uiPriority="50"/>
-    <w:lsdException w:name="List Table 6 Colorful Accent 4" w:uiPriority="51"/>
-    <w:lsdException w:name="List Table 7 Colorful Accent 4" w:uiPriority="52"/>
-    <w:lsdException w:name="List Table 1 Light Accent 5" w:uiPriority="46"/>
-    <w:lsdException w:name="List Table 2 Accent 5" w:uiPriority="47"/>
-    <w:lsdException w:name="List Table 3 Accent 5" w:uiPriority="48"/>
-    <w:lsdException w:name="List Table 4 Accent 5" w:uiPriority="49"/>
-    <w:lsdException w:name="List Table 5 Dark Accent 5" w:uiPriority="50"/>
-    <w:lsdException w:name="List Table 6 Colorful Accent 5" w:uiPriority="51"/>
-    <w:lsdException w:name="List Table 7 Colorful Accent 5" w:uiPriority="52"/>
-    <w:lsdException w:name="List Table 1 Light Accent 6" w:uiPriority="46"/>
-    <w:lsdException w:name="List Table 2 Accent 6" w:uiPriority="47"/>
-    <w:lsdException w:name="List Table 3 Accent 6" w:uiPriority="48"/>
-    <w:lsdException w:name="List Table 4 Accent 6" w:uiPriority="49"/>
-    <w:lsdException w:name="List Table 5 Dark Accent 6" w:uiPriority="50"/>
-    <w:lsdException w:name="List Table 6 Colorful Accent 6" w:uiPriority="51"/>
-    <w:lsdException w:name="List Table 7 Colorful Accent 6" w:uiPriority="52"/>
-    <w:lsdException w:name="Mention" w:semiHidden="1" w:unhideWhenUsed="1"/>
-    <w:lsdException w:name="Smart Hyperlink" w:semiHidden="1" w:unhideWhenUsed="1"/>
-    <w:lsdException w:name="Hashtag" w:semiHidden="1" w:unhideWhenUsed="1"/>
-    <w:lsdException w:name="Unresolved Mention" w:semiHidden="1" w:unhideWhenUsed="1"/>
-    <w:lsdException w:name="Smart Link" w:semiHidden="1" w:unhideWhenUsed="1"/>
-  </w:latentStyles>
-  <w:style w:type="paragraph" w:default="1" w:styleId="Normal">
-    <w:name w:val="Normal"/>
-    <w:qFormat/>
-  </w:style>
-  <w:style w:type="character" w:default="1" w:styleId="DefaultParagraphFont">
-    <w:name w:val="Default Paragraph Font"/>
-    <w:uiPriority w:val="1"/>
-    <w:semiHidden/>
-    <w:unhideWhenUsed/>
-  </w:style>
-  <w:style w:type="table" w:default="1" w:styleId="TableNormal">
-    <w:name w:val="Normal Table"/>
-    <w:uiPriority w:val="99"/>
-    <w:semiHidden/>
-    <w:unhideWhenUsed/>
-    <w:tblPr>
-      <w:tblInd w:w="0" w:type="dxa"/>
-      <w:tblCellMar>
-        <w:top w:w="0" w:type="dxa"/>
-        <w:left w:w="108" w:type="dxa"/>
-        <w:bottom w:w="0" w:type="dxa"/>
-        <w:right w:w="108" w:type="dxa"/>
-      </w:tblCellMar>
-    </w:tblPr>
-  </w:style>
-  <w:style w:type="numbering" w:default="1" w:styleId="NoList">
-    <w:name w:val="No List"/>
-    <w:uiPriority w:val="99"/>
-    <w:semiHidden/>
-    <w:unhideWhenUsed/>
-  </w:style>
-  <w:style w:type="paragraph" w:customStyle="1" w:styleId="BC1A84D5C2E740B1A4E9102D7AFA3504">
-    <w:name w:val="BC1A84D5C2E740B1A4E9102D7AFA3504"/>
-    <w:rsid w:val="00A01595"/>
-  </w:style>
-</w:styles>
-</file>
-
-<file path=word/glossary/webSettings.xml><?xml version="1.0" encoding="utf-8"?>
-<w:webSettings xmlns:mc="http://schemas.openxmlformats.org/markup-compatibility/2006" xmlns:r="http://schemas.openxmlformats.org/officeDocument/2006/relationships" xmlns:w="http://schemas.openxmlformats.org/wordprocessingml/2006/main" xmlns:w14="http://schemas.microsoft.com/office/word/2010/wordml" xmlns:w15="http://schemas.microsoft.com/office/word/2012/wordml" xmlns:w16cex="http://schemas.microsoft.com/office/word/2018/wordml/cex" xmlns:w16cid="http://schemas.microsoft.com/office/word/2016/wordml/cid" xmlns:w16="http://schemas.microsoft.com/office/word/2018/wordml" xmlns:w16sdtdh="http://schemas.microsoft.com/office/word/2020/wordml/sdtdatahash" xmlns:w16se="http://schemas.microsoft.com/office/word/2015/wordml/symex" mc:Ignorable="w14 w15 w16se w16cid w16 w16cex w16sdtdh">
-  <w:optimizeForBrowser/>
-  <w:allowPNG/>
-</w:webSettings>
-</file>
-
 <file path=word/theme/theme1.xml><?xml version="1.0" encoding="utf-8"?>
 <a:theme xmlns:a="http://schemas.openxmlformats.org/drawingml/2006/main" name="Office Theme">
   <a:themeElements>

</xml_diff>